<commit_message>
Agrega modelos de Factura y Suscripcion con sus respectivos repositorios
</commit_message>
<xml_diff>
--- a/Guia para realizar un proyecto desde cero/1.docx
+++ b/Guia para realizar un proyecto desde cero/1.docx
@@ -1,6 +1,6 @@
 
 <file path=word/document.xml><?xml version="1.0" encoding="utf-8"?>
-<w:document xmlns:wpc="http://schemas.microsoft.com/office/word/2010/wordprocessingCanvas" xmlns:cx="http://schemas.microsoft.com/office/drawing/2014/chartex" xmlns:cx1="http://schemas.microsoft.com/office/drawing/2015/9/8/chartex" xmlns:cx2="http://schemas.microsoft.com/office/drawing/2015/10/21/chartex" xmlns:cx3="http://schemas.microsoft.com/office/drawing/2016/5/9/chartex" xmlns:cx4="http://schemas.microsoft.com/office/drawing/2016/5/10/chartex" xmlns:cx5="http://schemas.microsoft.com/office/drawing/2016/5/11/chartex" xmlns:cx6="http://schemas.microsoft.com/office/drawing/2016/5/12/chartex" xmlns:cx7="http://schemas.microsoft.com/office/drawing/2016/5/13/chartex" xmlns:cx8="http://schemas.microsoft.com/office/drawing/2016/5/14/chartex" xmlns:mc="http://schemas.openxmlformats.org/markup-compatibility/2006" xmlns:aink="http://schemas.microsoft.com/office/drawing/2016/ink" xmlns:am3d="http://schemas.microsoft.com/office/drawing/2017/model3d" xmlns:o="urn:schemas-microsoft-com:office:office" xmlns:oel="http://schemas.microsoft.com/office/2019/extlst" xmlns:r="http://schemas.openxmlformats.org/officeDocument/2006/relationships" xmlns:m="http://schemas.openxmlformats.org/officeDocument/2006/math" xmlns:v="urn:schemas-microsoft-com:vml" xmlns:wp14="http://schemas.microsoft.com/office/word/2010/wordprocessingDrawing" xmlns:wp="http://schemas.openxmlformats.org/drawingml/2006/wordprocessingDrawing" xmlns:w10="urn:schemas-microsoft-com:office:word" xmlns:w="http://schemas.openxmlformats.org/wordprocessingml/2006/main" xmlns:w14="http://schemas.microsoft.com/office/word/2010/wordml" xmlns:w15="http://schemas.microsoft.com/office/word/2012/wordml" xmlns:w16cex="http://schemas.microsoft.com/office/word/2018/wordml/cex" xmlns:w16cid="http://schemas.microsoft.com/office/word/2016/wordml/cid" xmlns:w16="http://schemas.microsoft.com/office/word/2018/wordml" xmlns:w16du="http://schemas.microsoft.com/office/word/2023/wordml/word16du" xmlns:w16sdtdh="http://schemas.microsoft.com/office/word/2020/wordml/sdtdatahash" xmlns:w16sdtfl="http://schemas.microsoft.com/office/word/2024/wordml/sdtformatlock" xmlns:w16se="http://schemas.microsoft.com/office/word/2015/wordml/symex" xmlns:wpg="http://schemas.microsoft.com/office/word/2010/wordprocessingGroup" xmlns:wpi="http://schemas.microsoft.com/office/word/2010/wordprocessingInk" xmlns:wne="http://schemas.microsoft.com/office/word/2006/wordml" xmlns:wps="http://schemas.microsoft.com/office/word/2010/wordprocessingShape" mc:Ignorable="w14 w15 w16se w16cid w16 w16cex w16sdtdh w16sdtfl w16du wp14">
+<w:document xmlns:wpc="http://schemas.microsoft.com/office/word/2010/wordprocessingCanvas" xmlns:cx="http://schemas.microsoft.com/office/drawing/2014/chartex" xmlns:cx1="http://schemas.microsoft.com/office/drawing/2015/9/8/chartex" xmlns:cx2="http://schemas.microsoft.com/office/drawing/2015/10/21/chartex" xmlns:cx3="http://schemas.microsoft.com/office/drawing/2016/5/9/chartex" xmlns:cx4="http://schemas.microsoft.com/office/drawing/2016/5/10/chartex" xmlns:cx5="http://schemas.microsoft.com/office/drawing/2016/5/11/chartex" xmlns:cx6="http://schemas.microsoft.com/office/drawing/2016/5/12/chartex" xmlns:cx7="http://schemas.microsoft.com/office/drawing/2016/5/13/chartex" xmlns:cx8="http://schemas.microsoft.com/office/drawing/2016/5/14/chartex" xmlns:mc="http://schemas.openxmlformats.org/markup-compatibility/2006" xmlns:aink="http://schemas.microsoft.com/office/drawing/2016/ink" xmlns:am3d="http://schemas.microsoft.com/office/drawing/2017/model3d" xmlns:o="urn:schemas-microsoft-com:office:office" xmlns:r="http://schemas.openxmlformats.org/officeDocument/2006/relationships" xmlns:m="http://schemas.openxmlformats.org/officeDocument/2006/math" xmlns:v="urn:schemas-microsoft-com:vml" xmlns:wp14="http://schemas.microsoft.com/office/word/2010/wordprocessingDrawing" xmlns:wp="http://schemas.openxmlformats.org/drawingml/2006/wordprocessingDrawing" xmlns:w10="urn:schemas-microsoft-com:office:word" xmlns:w="http://schemas.openxmlformats.org/wordprocessingml/2006/main" xmlns:w14="http://schemas.microsoft.com/office/word/2010/wordml" xmlns:w15="http://schemas.microsoft.com/office/word/2012/wordml" xmlns:w16cex="http://schemas.microsoft.com/office/word/2018/wordml/cex" xmlns:w16cid="http://schemas.microsoft.com/office/word/2016/wordml/cid" xmlns:w16="http://schemas.microsoft.com/office/word/2018/wordml" xmlns:w16sdtdh="http://schemas.microsoft.com/office/word/2020/wordml/sdtdatahash" xmlns:w16se="http://schemas.microsoft.com/office/word/2015/wordml/symex" xmlns:wpg="http://schemas.microsoft.com/office/word/2010/wordprocessingGroup" xmlns:wpi="http://schemas.microsoft.com/office/word/2010/wordprocessingInk" xmlns:wne="http://schemas.microsoft.com/office/word/2006/wordml" xmlns:wps="http://schemas.microsoft.com/office/word/2010/wordprocessingShape" mc:Ignorable="w14 w15 w16se w16cid w16 w16cex w16sdtdh wp14">
   <w:body>
     <w:p>
       <w:pPr>
@@ -375,13 +375,22 @@
         </w:rPr>
         <w:t xml:space="preserve">4. </w:t>
       </w:r>
+      <w:proofErr w:type="spellStart"/>
       <w:proofErr w:type="gramStart"/>
       <w:r>
         <w:rPr>
           <w:b/>
           <w:bCs/>
         </w:rPr>
-        <w:t>Add .</w:t>
+        <w:t>Add</w:t>
+      </w:r>
+      <w:proofErr w:type="spellEnd"/>
+      <w:r>
+        <w:rPr>
+          <w:b/>
+          <w:bCs/>
+        </w:rPr>
+        <w:t xml:space="preserve"> .</w:t>
       </w:r>
       <w:proofErr w:type="spellStart"/>
       <w:r>
@@ -537,18 +546,13 @@
       </w:r>
       <w:proofErr w:type="gramEnd"/>
       <w:r>
-        <w:t>/</w:t>
-      </w:r>
-      <w:proofErr w:type="gramStart"/>
-      <w:r>
-        <w:t>, .</w:t>
+        <w:t>/, .</w:t>
       </w:r>
       <w:proofErr w:type="spellStart"/>
       <w:r>
         <w:t>vscode</w:t>
       </w:r>
       <w:proofErr w:type="spellEnd"/>
-      <w:proofErr w:type="gramEnd"/>
       <w:r>
         <w:t>/) o archivos del sistema operativo (.</w:t>
       </w:r>
@@ -596,7 +600,23 @@
           <w:b/>
           <w:bCs/>
         </w:rPr>
-        <w:t xml:space="preserve">5. Add </w:t>
+        <w:t xml:space="preserve">5. </w:t>
+      </w:r>
+      <w:proofErr w:type="spellStart"/>
+      <w:r>
+        <w:rPr>
+          <w:b/>
+          <w:bCs/>
+        </w:rPr>
+        <w:t>Add</w:t>
+      </w:r>
+      <w:proofErr w:type="spellEnd"/>
+      <w:r>
+        <w:rPr>
+          <w:b/>
+          <w:bCs/>
+        </w:rPr>
+        <w:t xml:space="preserve"> </w:t>
       </w:r>
       <w:proofErr w:type="spellStart"/>
       <w:r>
@@ -1561,18 +1581,13 @@
       <w:proofErr w:type="spellEnd"/>
       <w:proofErr w:type="gramEnd"/>
       <w:r>
-        <w:t xml:space="preserve">, el </w:t>
-      </w:r>
-      <w:proofErr w:type="gramStart"/>
-      <w:r>
-        <w:t>archivo .</w:t>
+        <w:t>, el archivo .</w:t>
       </w:r>
       <w:proofErr w:type="spellStart"/>
       <w:r>
         <w:t>gitignore</w:t>
       </w:r>
       <w:proofErr w:type="spellEnd"/>
-      <w:proofErr w:type="gramEnd"/>
       <w:r>
         <w:t xml:space="preserve"> y el archivo de la licencia.</w:t>
       </w:r>
@@ -1697,7 +1712,15 @@
       </w:r>
       <w:proofErr w:type="spellEnd"/>
       <w:r>
-        <w:t xml:space="preserve"> &amp; Billing Core</w:t>
+        <w:t xml:space="preserve"> &amp; </w:t>
+      </w:r>
+      <w:proofErr w:type="spellStart"/>
+      <w:r>
+        <w:t>Billing</w:t>
+      </w:r>
+      <w:proofErr w:type="spellEnd"/>
+      <w:r>
+        <w:t xml:space="preserve"> Core</w:t>
       </w:r>
     </w:p>
     <w:p/>
@@ -1957,15 +1980,20 @@
       </w:r>
       <w:proofErr w:type="gramEnd"/>
       <w:r>
-        <w:t xml:space="preserve"> **Fase </w:t>
+        <w:t xml:space="preserve"> **Fase 1:** Diseño de Arquitectura y Modelo Entidad-Relación (MySQL).</w:t>
+      </w:r>
+    </w:p>
+    <w:p>
+      <w:r>
+        <w:t xml:space="preserve">* </w:t>
       </w:r>
       <w:proofErr w:type="gramStart"/>
       <w:r>
-        <w:t>1:*</w:t>
+        <w:t>[ ]</w:t>
       </w:r>
       <w:proofErr w:type="gramEnd"/>
       <w:r>
-        <w:t>* Diseño de Arquitectura y Modelo Entidad-Relación (MySQL).</w:t>
+        <w:t xml:space="preserve"> **Fase 2:** Construcción del Núcleo de la API REST (Spring Boot).</w:t>
       </w:r>
     </w:p>
     <w:p>
@@ -1978,15 +2006,36 @@
       </w:r>
       <w:proofErr w:type="gramEnd"/>
       <w:r>
-        <w:t xml:space="preserve"> **Fase </w:t>
+        <w:t xml:space="preserve"> **Fase 3:** Desarrollo de Interfaz de Usuario e Integración (</w:t>
+      </w:r>
+      <w:proofErr w:type="spellStart"/>
+      <w:r>
+        <w:t>Frontend</w:t>
+      </w:r>
+      <w:proofErr w:type="spellEnd"/>
+      <w:r>
+        <w:t xml:space="preserve"> / JS </w:t>
+      </w:r>
+      <w:proofErr w:type="spellStart"/>
+      <w:r>
+        <w:t>Fetch</w:t>
+      </w:r>
+      <w:proofErr w:type="spellEnd"/>
+      <w:r>
+        <w:t>).</w:t>
+      </w:r>
+    </w:p>
+    <w:p>
+      <w:r>
+        <w:t xml:space="preserve">* </w:t>
       </w:r>
       <w:proofErr w:type="gramStart"/>
       <w:r>
-        <w:t>2:*</w:t>
+        <w:t>[ ]</w:t>
       </w:r>
       <w:proofErr w:type="gramEnd"/>
       <w:r>
-        <w:t>* Construcción del Núcleo de la API REST (Spring Boot).</w:t>
+        <w:t xml:space="preserve"> **Fase 4:** Automatización de Base de Datos e Integración de IA.</w:t>
       </w:r>
     </w:p>
     <w:p>
@@ -1999,65 +2048,7 @@
       </w:r>
       <w:proofErr w:type="gramEnd"/>
       <w:r>
-        <w:t xml:space="preserve"> **Fase </w:t>
-      </w:r>
-      <w:proofErr w:type="gramStart"/>
-      <w:r>
-        <w:t>3:*</w:t>
-      </w:r>
-      <w:proofErr w:type="gramEnd"/>
-      <w:r>
-        <w:t>* Desarrollo de Interfaz de Usuario e Integración (</w:t>
-      </w:r>
-      <w:proofErr w:type="spellStart"/>
-      <w:r>
-        <w:t>Frontend</w:t>
-      </w:r>
-      <w:proofErr w:type="spellEnd"/>
-      <w:r>
-        <w:t xml:space="preserve"> / JS Fetch).</w:t>
-      </w:r>
-    </w:p>
-    <w:p>
-      <w:r>
-        <w:t xml:space="preserve">* </w:t>
-      </w:r>
-      <w:proofErr w:type="gramStart"/>
-      <w:r>
-        <w:t>[ ]</w:t>
-      </w:r>
-      <w:proofErr w:type="gramEnd"/>
-      <w:r>
-        <w:t xml:space="preserve"> **Fase </w:t>
-      </w:r>
-      <w:proofErr w:type="gramStart"/>
-      <w:r>
-        <w:t>4:*</w:t>
-      </w:r>
-      <w:proofErr w:type="gramEnd"/>
-      <w:r>
-        <w:t>* Automatización de Base de Datos e Integración de IA.</w:t>
-      </w:r>
-    </w:p>
-    <w:p>
-      <w:r>
-        <w:t xml:space="preserve">* </w:t>
-      </w:r>
-      <w:proofErr w:type="gramStart"/>
-      <w:r>
-        <w:t>[ ]</w:t>
-      </w:r>
-      <w:proofErr w:type="gramEnd"/>
-      <w:r>
-        <w:t xml:space="preserve"> **Fase </w:t>
-      </w:r>
-      <w:proofErr w:type="gramStart"/>
-      <w:r>
-        <w:t>5:*</w:t>
-      </w:r>
-      <w:proofErr w:type="gramEnd"/>
-      <w:r>
-        <w:t>* Despliegue en la Nube y Documentación Final.</w:t>
+        <w:t xml:space="preserve"> **Fase 5:** Despliegue en la Nube y Documentación Final.</w:t>
       </w:r>
     </w:p>
     <w:p>
@@ -2819,7 +2810,15 @@
       </w:r>
       <w:proofErr w:type="spellEnd"/>
       <w:r>
-        <w:t xml:space="preserve"> &amp; Billing Core</w:t>
+        <w:t xml:space="preserve"> &amp; </w:t>
+      </w:r>
+      <w:proofErr w:type="spellStart"/>
+      <w:r>
+        <w:t>Billing</w:t>
+      </w:r>
+      <w:proofErr w:type="spellEnd"/>
+      <w:r>
+        <w:t xml:space="preserve"> Core</w:t>
       </w:r>
     </w:p>
     <w:p/>
@@ -3079,15 +3078,20 @@
       </w:r>
       <w:proofErr w:type="gramEnd"/>
       <w:r>
-        <w:t xml:space="preserve"> **Fase </w:t>
+        <w:t xml:space="preserve"> **Fase 1:** Diseño de Arquitectura y Modelo Entidad-Relación (MySQL).</w:t>
+      </w:r>
+    </w:p>
+    <w:p>
+      <w:r>
+        <w:t xml:space="preserve">* </w:t>
       </w:r>
       <w:proofErr w:type="gramStart"/>
       <w:r>
-        <w:t>1:*</w:t>
+        <w:t>[ ]</w:t>
       </w:r>
       <w:proofErr w:type="gramEnd"/>
       <w:r>
-        <w:t>* Diseño de Arquitectura y Modelo Entidad-Relación (MySQL).</w:t>
+        <w:t xml:space="preserve"> **Fase 2:** Construcción del Núcleo de la API REST (Spring Boot).</w:t>
       </w:r>
     </w:p>
     <w:p>
@@ -3100,15 +3104,36 @@
       </w:r>
       <w:proofErr w:type="gramEnd"/>
       <w:r>
-        <w:t xml:space="preserve"> **Fase </w:t>
+        <w:t xml:space="preserve"> **Fase 3:** Desarrollo de Interfaz de Usuario e Integración (</w:t>
+      </w:r>
+      <w:proofErr w:type="spellStart"/>
+      <w:r>
+        <w:t>Frontend</w:t>
+      </w:r>
+      <w:proofErr w:type="spellEnd"/>
+      <w:r>
+        <w:t xml:space="preserve"> / JS </w:t>
+      </w:r>
+      <w:proofErr w:type="spellStart"/>
+      <w:r>
+        <w:t>Fetch</w:t>
+      </w:r>
+      <w:proofErr w:type="spellEnd"/>
+      <w:r>
+        <w:t>).</w:t>
+      </w:r>
+    </w:p>
+    <w:p>
+      <w:r>
+        <w:t xml:space="preserve">* </w:t>
       </w:r>
       <w:proofErr w:type="gramStart"/>
       <w:r>
-        <w:t>2:*</w:t>
+        <w:t>[ ]</w:t>
       </w:r>
       <w:proofErr w:type="gramEnd"/>
       <w:r>
-        <w:t>* Construcción del Núcleo de la API REST (Spring Boot).</w:t>
+        <w:t xml:space="preserve"> **Fase 4:** Automatización de Base de Datos e Integración de IA.</w:t>
       </w:r>
     </w:p>
     <w:p>
@@ -3121,65 +3146,7 @@
       </w:r>
       <w:proofErr w:type="gramEnd"/>
       <w:r>
-        <w:t xml:space="preserve"> **Fase </w:t>
-      </w:r>
-      <w:proofErr w:type="gramStart"/>
-      <w:r>
-        <w:t>3:*</w:t>
-      </w:r>
-      <w:proofErr w:type="gramEnd"/>
-      <w:r>
-        <w:t>* Desarrollo de Interfaz de Usuario e Integración (</w:t>
-      </w:r>
-      <w:proofErr w:type="spellStart"/>
-      <w:r>
-        <w:t>Frontend</w:t>
-      </w:r>
-      <w:proofErr w:type="spellEnd"/>
-      <w:r>
-        <w:t xml:space="preserve"> / JS Fetch).</w:t>
-      </w:r>
-    </w:p>
-    <w:p>
-      <w:r>
-        <w:t xml:space="preserve">* </w:t>
-      </w:r>
-      <w:proofErr w:type="gramStart"/>
-      <w:r>
-        <w:t>[ ]</w:t>
-      </w:r>
-      <w:proofErr w:type="gramEnd"/>
-      <w:r>
-        <w:t xml:space="preserve"> **Fase </w:t>
-      </w:r>
-      <w:proofErr w:type="gramStart"/>
-      <w:r>
-        <w:t>4:*</w:t>
-      </w:r>
-      <w:proofErr w:type="gramEnd"/>
-      <w:r>
-        <w:t>* Automatización de Base de Datos e Integración de IA.</w:t>
-      </w:r>
-    </w:p>
-    <w:p>
-      <w:r>
-        <w:t xml:space="preserve">* </w:t>
-      </w:r>
-      <w:proofErr w:type="gramStart"/>
-      <w:r>
-        <w:t>[ ]</w:t>
-      </w:r>
-      <w:proofErr w:type="gramEnd"/>
-      <w:r>
-        <w:t xml:space="preserve"> **Fase </w:t>
-      </w:r>
-      <w:proofErr w:type="gramStart"/>
-      <w:r>
-        <w:t>5:*</w:t>
-      </w:r>
-      <w:proofErr w:type="gramEnd"/>
-      <w:r>
-        <w:t>* Despliegue en la Nube y Documentación Final.</w:t>
+        <w:t xml:space="preserve"> **Fase 5:** Despliegue en la Nube y Documentación Final.</w:t>
       </w:r>
     </w:p>
     <w:p>
@@ -3338,6 +3305,1383 @@
       </w:r>
       <w:r>
         <w:t>. Gracias a esto, cuando subamos el código, esa basura de configuración no se va a ir a internet. ¡Punto a favor para la prolijidad de tu repositorio!</w:t>
+      </w:r>
+    </w:p>
+    <w:p>
+      <w:pPr>
+        <w:pStyle w:val="Ttulo2"/>
+      </w:pPr>
+      <w:r>
+        <w:rPr>
+          <w:rFonts w:ascii="Segoe UI Emoji" w:hAnsi="Segoe UI Emoji" w:cs="Segoe UI Emoji"/>
+        </w:rPr>
+        <w:t>🏗</w:t>
+      </w:r>
+      <w:r>
+        <w:t>️ Fase 1: El Modelo Entidad-Relación (Base de Datos)</w:t>
+      </w:r>
+    </w:p>
+    <w:p>
+      <w:pPr>
+        <w:pStyle w:val="NormalWeb"/>
+      </w:pPr>
+      <w:r>
+        <w:t xml:space="preserve">En la ingeniería de software profesional, </w:t>
+      </w:r>
+      <w:r>
+        <w:rPr>
+          <w:b/>
+          <w:bCs/>
+        </w:rPr>
+        <w:t>nunca se empieza tirando código en Java</w:t>
+      </w:r>
+      <w:r>
+        <w:t xml:space="preserve">. Si te </w:t>
+      </w:r>
+      <w:proofErr w:type="spellStart"/>
+      <w:r>
+        <w:t>ponés</w:t>
+      </w:r>
+      <w:proofErr w:type="spellEnd"/>
+      <w:r>
+        <w:t xml:space="preserve"> a escribir código Spring </w:t>
+      </w:r>
+      <w:proofErr w:type="spellStart"/>
+      <w:r>
+        <w:t>Boot</w:t>
+      </w:r>
+      <w:proofErr w:type="spellEnd"/>
+      <w:r>
+        <w:t xml:space="preserve"> sin saber cómo vas a estructurar tus datos, vas a terminar modificando las clases de Java veinte veces porque te olvidaste de un atributo o de una relación.</w:t>
+      </w:r>
+    </w:p>
+    <w:p>
+      <w:pPr>
+        <w:pStyle w:val="NormalWeb"/>
+      </w:pPr>
+      <w:r>
+        <w:t xml:space="preserve">Primero se diseñan los cimientos. El cimiento de un sistema SaaS es el </w:t>
+      </w:r>
+      <w:r>
+        <w:rPr>
+          <w:b/>
+          <w:bCs/>
+        </w:rPr>
+        <w:t>Modelo Entidad-Relación (MER)</w:t>
+      </w:r>
+      <w:r>
+        <w:t xml:space="preserve"> en la base de datos relacional (MySQL).</w:t>
+      </w:r>
+    </w:p>
+    <w:p>
+      <w:pPr>
+        <w:pStyle w:val="Ttulo3"/>
+      </w:pPr>
+      <w:r>
+        <w:t>¿Por qué usamos una Base de Datos Relacional (MySQL)?</w:t>
+      </w:r>
+    </w:p>
+    <w:p>
+      <w:pPr>
+        <w:pStyle w:val="NormalWeb"/>
+      </w:pPr>
+      <w:r>
+        <w:t xml:space="preserve">Porque en un sistema de facturación y usuarios la </w:t>
+      </w:r>
+      <w:r>
+        <w:rPr>
+          <w:b/>
+          <w:bCs/>
+        </w:rPr>
+        <w:t>consistencia y la integridad de los datos son sagradas</w:t>
+      </w:r>
+      <w:r>
+        <w:t xml:space="preserve">. Necesitamos asegurar </w:t>
+      </w:r>
+      <w:proofErr w:type="gramStart"/>
+      <w:r>
+        <w:t>que</w:t>
+      </w:r>
+      <w:proofErr w:type="gramEnd"/>
+      <w:r>
+        <w:t xml:space="preserve"> si una factura existe, pertenezca a un usuario real, y que si una suscripción dice "Activa", esté vinculada a un plan existente. </w:t>
+      </w:r>
+      <w:r>
+        <w:lastRenderedPageBreak/>
+        <w:t>MySQL implementa reglas estrictas (restricciones de clave foránea) que impiden que los datos se corrompan o queden "huérfanos".</w:t>
+      </w:r>
+    </w:p>
+    <w:p>
+      <w:pPr>
+        <w:pStyle w:val="Ttulo2"/>
+      </w:pPr>
+      <w:r>
+        <w:rPr>
+          <w:rFonts w:ascii="Segoe UI Emoji" w:hAnsi="Segoe UI Emoji" w:cs="Segoe UI Emoji"/>
+        </w:rPr>
+        <w:t>📊</w:t>
+      </w:r>
+      <w:r>
+        <w:t xml:space="preserve"> Las 4 Entidades Principales de Nuestro Negocio</w:t>
+      </w:r>
+    </w:p>
+    <w:p>
+      <w:pPr>
+        <w:pStyle w:val="NormalWeb"/>
+      </w:pPr>
+      <w:r>
+        <w:t xml:space="preserve">Para nuestro Core de Suscripciones, vamos a modelar </w:t>
+      </w:r>
+      <w:r>
+        <w:rPr>
+          <w:b/>
+          <w:bCs/>
+        </w:rPr>
+        <w:t>4 tablas iniciales</w:t>
+      </w:r>
+      <w:r>
+        <w:t>. Vamos a analizarlas una por una, de menor a mayor complejidad, detallando qué campos (columnas) necesitan y por qué.</w:t>
+      </w:r>
+    </w:p>
+    <w:p>
+      <w:pPr>
+        <w:pStyle w:val="Ttulo3"/>
+      </w:pPr>
+      <w:r>
+        <w:t xml:space="preserve">1. Tabla: </w:t>
+      </w:r>
+      <w:r>
+        <w:rPr>
+          <w:rStyle w:val="CdigoHTML"/>
+          <w:rFonts w:eastAsiaTheme="majorEastAsia"/>
+        </w:rPr>
+        <w:t>planes</w:t>
+      </w:r>
+      <w:r>
+        <w:t xml:space="preserve"> (Planes)</w:t>
+      </w:r>
+    </w:p>
+    <w:p>
+      <w:pPr>
+        <w:pStyle w:val="NormalWeb"/>
+      </w:pPr>
+      <w:r>
+        <w:t>Es la tabla más estática del sistema. Define la oferta comercial del SaaS.</w:t>
+      </w:r>
+    </w:p>
+    <w:p>
+      <w:pPr>
+        <w:pStyle w:val="NormalWeb"/>
+        <w:numPr>
+          <w:ilvl w:val="0"/>
+          <w:numId w:val="16"/>
+        </w:numPr>
+      </w:pPr>
+      <w:r>
+        <w:rPr>
+          <w:rStyle w:val="CdigoHTML"/>
+          <w:rFonts w:eastAsiaTheme="majorEastAsia"/>
+          <w:b/>
+          <w:bCs/>
+        </w:rPr>
+        <w:t>id</w:t>
+      </w:r>
+      <w:r>
+        <w:t xml:space="preserve"> (BIGINT, </w:t>
+      </w:r>
+      <w:proofErr w:type="spellStart"/>
+      <w:r>
+        <w:t>Primary</w:t>
+      </w:r>
+      <w:proofErr w:type="spellEnd"/>
+      <w:r>
+        <w:t xml:space="preserve"> Key, </w:t>
+      </w:r>
+      <w:proofErr w:type="spellStart"/>
+      <w:r>
+        <w:t>Auto-increment</w:t>
+      </w:r>
+      <w:proofErr w:type="spellEnd"/>
+      <w:r>
+        <w:t xml:space="preserve">): El identificador único de cada plan. Usamos </w:t>
+      </w:r>
+      <w:r>
+        <w:rPr>
+          <w:rStyle w:val="CdigoHTML"/>
+          <w:rFonts w:eastAsiaTheme="majorEastAsia"/>
+        </w:rPr>
+        <w:t>BIGINT</w:t>
+      </w:r>
+      <w:r>
+        <w:t xml:space="preserve"> (entero de 64 bits) por escalabilidad; es una buena práctica en la industria para que nunca te quedes sin números disponibles.</w:t>
+      </w:r>
+    </w:p>
+    <w:p>
+      <w:pPr>
+        <w:pStyle w:val="NormalWeb"/>
+        <w:numPr>
+          <w:ilvl w:val="0"/>
+          <w:numId w:val="16"/>
+        </w:numPr>
+      </w:pPr>
+      <w:r>
+        <w:rPr>
+          <w:rStyle w:val="CdigoHTML"/>
+          <w:rFonts w:eastAsiaTheme="majorEastAsia"/>
+          <w:b/>
+          <w:bCs/>
+        </w:rPr>
+        <w:t>nombre</w:t>
+      </w:r>
+      <w:r>
+        <w:t xml:space="preserve"> (</w:t>
+      </w:r>
+      <w:proofErr w:type="gramStart"/>
+      <w:r>
+        <w:t>VARCHAR(</w:t>
+      </w:r>
+      <w:proofErr w:type="gramEnd"/>
+      <w:r>
+        <w:t>50)): El nombre del plan (</w:t>
+      </w:r>
+      <w:proofErr w:type="spellStart"/>
+      <w:r>
+        <w:t>ej</w:t>
+      </w:r>
+      <w:proofErr w:type="spellEnd"/>
+      <w:r>
+        <w:t xml:space="preserve">: "Basic", "Premium"). </w:t>
+      </w:r>
+      <w:proofErr w:type="gramStart"/>
+      <w:r>
+        <w:rPr>
+          <w:rStyle w:val="CdigoHTML"/>
+          <w:rFonts w:eastAsiaTheme="majorEastAsia"/>
+        </w:rPr>
+        <w:t>VARCHAR(</w:t>
+      </w:r>
+      <w:proofErr w:type="gramEnd"/>
+      <w:r>
+        <w:rPr>
+          <w:rStyle w:val="CdigoHTML"/>
+          <w:rFonts w:eastAsiaTheme="majorEastAsia"/>
+        </w:rPr>
+        <w:t>50)</w:t>
+      </w:r>
+      <w:r>
+        <w:t xml:space="preserve"> es suficiente espacio y limita el uso de memoria en disco.</w:t>
+      </w:r>
+    </w:p>
+    <w:p>
+      <w:pPr>
+        <w:pStyle w:val="NormalWeb"/>
+        <w:numPr>
+          <w:ilvl w:val="0"/>
+          <w:numId w:val="16"/>
+        </w:numPr>
+      </w:pPr>
+      <w:r>
+        <w:rPr>
+          <w:rStyle w:val="CdigoHTML"/>
+          <w:rFonts w:eastAsiaTheme="majorEastAsia"/>
+          <w:b/>
+          <w:bCs/>
+        </w:rPr>
+        <w:t>precio</w:t>
+      </w:r>
+      <w:r>
+        <w:t xml:space="preserve"> (</w:t>
+      </w:r>
+      <w:proofErr w:type="gramStart"/>
+      <w:r>
+        <w:t>DECIMAL(</w:t>
+      </w:r>
+      <w:proofErr w:type="gramEnd"/>
+      <w:r>
+        <w:t>10,2)): El costo mensual.</w:t>
+      </w:r>
+    </w:p>
+    <w:p>
+      <w:pPr>
+        <w:pStyle w:val="NormalWeb"/>
+        <w:numPr>
+          <w:ilvl w:val="1"/>
+          <w:numId w:val="16"/>
+        </w:numPr>
+      </w:pPr>
+      <w:r>
+        <w:rPr>
+          <w:i/>
+          <w:iCs/>
+        </w:rPr>
+        <w:t>¿Por qué DECIMAL y no FLOAT/DOUBLE?</w:t>
+      </w:r>
+      <w:r>
+        <w:t xml:space="preserve"> </w:t>
+      </w:r>
+      <w:r>
+        <w:rPr>
+          <w:b/>
+          <w:bCs/>
+        </w:rPr>
+        <w:t>Regla de oro universitaria:</w:t>
+      </w:r>
+      <w:r>
+        <w:t xml:space="preserve"> En software financiero </w:t>
+      </w:r>
+      <w:r>
+        <w:rPr>
+          <w:b/>
+          <w:bCs/>
+        </w:rPr>
+        <w:t>NUNCA</w:t>
+      </w:r>
+      <w:r>
+        <w:t xml:space="preserve"> se usan tipos de datos de punto flotante (</w:t>
+      </w:r>
+      <w:r>
+        <w:rPr>
+          <w:rStyle w:val="CdigoHTML"/>
+          <w:rFonts w:eastAsiaTheme="majorEastAsia"/>
+        </w:rPr>
+        <w:t>FLOAT</w:t>
+      </w:r>
+      <w:r>
+        <w:t xml:space="preserve"> o </w:t>
+      </w:r>
+      <w:r>
+        <w:rPr>
+          <w:rStyle w:val="CdigoHTML"/>
+          <w:rFonts w:eastAsiaTheme="majorEastAsia"/>
+        </w:rPr>
+        <w:t>DOUBLE</w:t>
+      </w:r>
+      <w:r>
+        <w:t xml:space="preserve">) porque sufren de errores de redondeo binario debido a la especificación IEEE 754. El tipo </w:t>
+      </w:r>
+      <w:proofErr w:type="gramStart"/>
+      <w:r>
+        <w:rPr>
+          <w:rStyle w:val="CdigoHTML"/>
+          <w:rFonts w:eastAsiaTheme="majorEastAsia"/>
+        </w:rPr>
+        <w:t>DECIMAL(</w:t>
+      </w:r>
+      <w:proofErr w:type="gramEnd"/>
+      <w:r>
+        <w:rPr>
+          <w:rStyle w:val="CdigoHTML"/>
+          <w:rFonts w:eastAsiaTheme="majorEastAsia"/>
+        </w:rPr>
+        <w:t>10,2)</w:t>
+      </w:r>
+      <w:r>
+        <w:t xml:space="preserve"> almacena los números como cadenas exactas: 10 dígitos en total, con 2 dígitos destinados exclusivamente a los centavos (</w:t>
+      </w:r>
+      <w:proofErr w:type="spellStart"/>
+      <w:r>
+        <w:t>ej</w:t>
+      </w:r>
+      <w:proofErr w:type="spellEnd"/>
+      <w:r>
+        <w:t xml:space="preserve">: </w:t>
+      </w:r>
+      <w:r>
+        <w:rPr>
+          <w:rStyle w:val="CdigoHTML"/>
+          <w:rFonts w:eastAsiaTheme="majorEastAsia"/>
+        </w:rPr>
+        <w:t>99999999.99</w:t>
+      </w:r>
+      <w:r>
+        <w:t>).</w:t>
+      </w:r>
+    </w:p>
+    <w:p>
+      <w:pPr>
+        <w:pStyle w:val="Ttulo3"/>
+      </w:pPr>
+      <w:r>
+        <w:t xml:space="preserve">2. Tabla: </w:t>
+      </w:r>
+      <w:r>
+        <w:rPr>
+          <w:rStyle w:val="CdigoHTML"/>
+          <w:rFonts w:eastAsiaTheme="majorEastAsia"/>
+        </w:rPr>
+        <w:t>usuarios</w:t>
+      </w:r>
+      <w:r>
+        <w:t xml:space="preserve"> (Usuarios)</w:t>
+      </w:r>
+    </w:p>
+    <w:p>
+      <w:pPr>
+        <w:pStyle w:val="NormalWeb"/>
+      </w:pPr>
+      <w:r>
+        <w:t>Almacena las cuentas de las personas que acceden al sistema.</w:t>
+      </w:r>
+    </w:p>
+    <w:p>
+      <w:pPr>
+        <w:pStyle w:val="NormalWeb"/>
+        <w:numPr>
+          <w:ilvl w:val="0"/>
+          <w:numId w:val="17"/>
+        </w:numPr>
+      </w:pPr>
+      <w:r>
+        <w:rPr>
+          <w:rStyle w:val="CdigoHTML"/>
+          <w:rFonts w:eastAsiaTheme="majorEastAsia"/>
+          <w:b/>
+          <w:bCs/>
+        </w:rPr>
+        <w:t>id</w:t>
+      </w:r>
+      <w:r>
+        <w:t xml:space="preserve"> (BIGINT, </w:t>
+      </w:r>
+      <w:proofErr w:type="spellStart"/>
+      <w:r>
+        <w:t>Primary</w:t>
+      </w:r>
+      <w:proofErr w:type="spellEnd"/>
+      <w:r>
+        <w:t xml:space="preserve"> Key, </w:t>
+      </w:r>
+      <w:proofErr w:type="spellStart"/>
+      <w:r>
+        <w:t>Auto-increment</w:t>
+      </w:r>
+      <w:proofErr w:type="spellEnd"/>
+      <w:r>
+        <w:t>): Identificador único del usuario.</w:t>
+      </w:r>
+    </w:p>
+    <w:p>
+      <w:pPr>
+        <w:pStyle w:val="NormalWeb"/>
+        <w:numPr>
+          <w:ilvl w:val="0"/>
+          <w:numId w:val="17"/>
+        </w:numPr>
+      </w:pPr>
+      <w:r>
+        <w:rPr>
+          <w:rStyle w:val="CdigoHTML"/>
+          <w:rFonts w:eastAsiaTheme="majorEastAsia"/>
+          <w:b/>
+          <w:bCs/>
+        </w:rPr>
+        <w:t>nombre</w:t>
+      </w:r>
+      <w:r>
+        <w:t xml:space="preserve"> (</w:t>
+      </w:r>
+      <w:proofErr w:type="gramStart"/>
+      <w:r>
+        <w:t>VARCHAR(</w:t>
+      </w:r>
+      <w:proofErr w:type="gramEnd"/>
+      <w:r>
+        <w:t>100)): Nombre completo del usuario.</w:t>
+      </w:r>
+    </w:p>
+    <w:p>
+      <w:pPr>
+        <w:pStyle w:val="NormalWeb"/>
+        <w:numPr>
+          <w:ilvl w:val="0"/>
+          <w:numId w:val="17"/>
+        </w:numPr>
+      </w:pPr>
+      <w:r>
+        <w:rPr>
+          <w:rStyle w:val="CdigoHTML"/>
+          <w:rFonts w:eastAsiaTheme="majorEastAsia"/>
+          <w:b/>
+          <w:bCs/>
+        </w:rPr>
+        <w:t>email</w:t>
+      </w:r>
+      <w:r>
+        <w:t xml:space="preserve"> (</w:t>
+      </w:r>
+      <w:proofErr w:type="gramStart"/>
+      <w:r>
+        <w:t>VARCHAR(</w:t>
+      </w:r>
+      <w:proofErr w:type="gramEnd"/>
+      <w:r>
+        <w:t xml:space="preserve">150), UNIQUE): El correo electrónico. Lleva la restricción </w:t>
+      </w:r>
+      <w:r>
+        <w:rPr>
+          <w:rStyle w:val="CdigoHTML"/>
+          <w:rFonts w:eastAsiaTheme="majorEastAsia"/>
+        </w:rPr>
+        <w:t>UNIQUE</w:t>
+      </w:r>
+      <w:r>
+        <w:t xml:space="preserve"> (Único) a nivel de base de datos.</w:t>
+      </w:r>
+    </w:p>
+    <w:p>
+      <w:pPr>
+        <w:pStyle w:val="NormalWeb"/>
+        <w:numPr>
+          <w:ilvl w:val="1"/>
+          <w:numId w:val="17"/>
+        </w:numPr>
+      </w:pPr>
+      <w:r>
+        <w:rPr>
+          <w:i/>
+          <w:iCs/>
+        </w:rPr>
+        <w:t>¿Por qué?</w:t>
+      </w:r>
+      <w:r>
+        <w:t xml:space="preserve"> Para evitar que dos personas se registren con el mismo mail. Si la base de datos lo frena desde su motor, es imposible que ocurra una duplicación, asegurando la consistencia antes de que llegue a Java.</w:t>
+      </w:r>
+    </w:p>
+    <w:p>
+      <w:pPr>
+        <w:pStyle w:val="NormalWeb"/>
+        <w:numPr>
+          <w:ilvl w:val="0"/>
+          <w:numId w:val="17"/>
+        </w:numPr>
+      </w:pPr>
+      <w:proofErr w:type="spellStart"/>
+      <w:r>
+        <w:rPr>
+          <w:rStyle w:val="CdigoHTML"/>
+          <w:rFonts w:eastAsiaTheme="majorEastAsia"/>
+          <w:b/>
+          <w:bCs/>
+        </w:rPr>
+        <w:t>password</w:t>
+      </w:r>
+      <w:proofErr w:type="spellEnd"/>
+      <w:r>
+        <w:t xml:space="preserve"> (</w:t>
+      </w:r>
+      <w:proofErr w:type="gramStart"/>
+      <w:r>
+        <w:t>VARCHAR(</w:t>
+      </w:r>
+      <w:proofErr w:type="gramEnd"/>
+      <w:r>
+        <w:t xml:space="preserve">255)): La contraseña. Se le asigna un tamaño de 255 caracteres porque, aunque la contraseña del usuario sea corta, </w:t>
+      </w:r>
+      <w:r>
+        <w:rPr>
+          <w:b/>
+          <w:bCs/>
+        </w:rPr>
+        <w:t>nunca</w:t>
+      </w:r>
+      <w:r>
+        <w:t xml:space="preserve"> se guarda en texto plano; se guarda encriptada mediante algoritmos de </w:t>
+      </w:r>
+      <w:proofErr w:type="spellStart"/>
+      <w:r>
+        <w:t>hashing</w:t>
+      </w:r>
+      <w:proofErr w:type="spellEnd"/>
+      <w:r>
+        <w:t xml:space="preserve"> (como </w:t>
+      </w:r>
+      <w:proofErr w:type="spellStart"/>
+      <w:r>
+        <w:t>BCrypt</w:t>
+      </w:r>
+      <w:proofErr w:type="spellEnd"/>
+      <w:r>
+        <w:t>), los cuales generan cadenas largas de texto fijo.</w:t>
+      </w:r>
+    </w:p>
+    <w:p>
+      <w:pPr>
+        <w:pStyle w:val="NormalWeb"/>
+        <w:numPr>
+          <w:ilvl w:val="0"/>
+          <w:numId w:val="17"/>
+        </w:numPr>
+      </w:pPr>
+      <w:proofErr w:type="spellStart"/>
+      <w:r>
+        <w:rPr>
+          <w:rStyle w:val="CdigoHTML"/>
+          <w:rFonts w:eastAsiaTheme="majorEastAsia"/>
+          <w:b/>
+          <w:bCs/>
+        </w:rPr>
+        <w:t>fecha_registro</w:t>
+      </w:r>
+      <w:proofErr w:type="spellEnd"/>
+      <w:r>
+        <w:t xml:space="preserve"> (TIMESTAMP): Registra el momento exacto en que se creó la cuenta.</w:t>
+      </w:r>
+    </w:p>
+    <w:p>
+      <w:pPr>
+        <w:pStyle w:val="Ttulo3"/>
+      </w:pPr>
+      <w:r>
+        <w:rPr>
+          <w:rFonts w:ascii="Segoe UI Emoji" w:hAnsi="Segoe UI Emoji" w:cs="Segoe UI Emoji"/>
+        </w:rPr>
+        <w:t>🔥</w:t>
+      </w:r>
+      <w:r>
+        <w:t xml:space="preserve"> Pausa Académica: Tipos de Relaciones</w:t>
+      </w:r>
+    </w:p>
+    <w:p>
+      <w:pPr>
+        <w:pStyle w:val="NormalWeb"/>
+      </w:pPr>
+      <w:r>
+        <w:t xml:space="preserve">Antes de pasar a las siguientes dos tablas, tenemos que conectar </w:t>
+      </w:r>
+      <w:r>
+        <w:rPr>
+          <w:rStyle w:val="CdigoHTML"/>
+          <w:rFonts w:eastAsiaTheme="majorEastAsia"/>
+        </w:rPr>
+        <w:t>usuarios</w:t>
+      </w:r>
+      <w:r>
+        <w:t xml:space="preserve"> y </w:t>
+      </w:r>
+      <w:r>
+        <w:rPr>
+          <w:rStyle w:val="CdigoHTML"/>
+          <w:rFonts w:eastAsiaTheme="majorEastAsia"/>
+        </w:rPr>
+        <w:t>planes</w:t>
+      </w:r>
+      <w:r>
+        <w:t>.</w:t>
+      </w:r>
+    </w:p>
+    <w:p>
+      <w:pPr>
+        <w:pStyle w:val="NormalWeb"/>
+        <w:numPr>
+          <w:ilvl w:val="0"/>
+          <w:numId w:val="18"/>
+        </w:numPr>
+      </w:pPr>
+      <w:r>
+        <w:lastRenderedPageBreak/>
+        <w:t>Un usuario puede elegir un plan. Pero un plan puede tener muchos usuarios.</w:t>
+      </w:r>
+    </w:p>
+    <w:p>
+      <w:pPr>
+        <w:pStyle w:val="NormalWeb"/>
+        <w:numPr>
+          <w:ilvl w:val="0"/>
+          <w:numId w:val="18"/>
+        </w:numPr>
+      </w:pPr>
+      <w:r>
+        <w:t xml:space="preserve">Además, el negocio de las suscripciones dicta que un usuario hoy puede estar en el Plan Básico, el mes que viene en el Premium, y el año que viene cancelarlo. Si metiéramos el plan adentro de la tabla de usuarios, perderíamos todo el historial de lo que pagó antes. Por eso, necesitamos una </w:t>
+      </w:r>
+      <w:r>
+        <w:rPr>
+          <w:b/>
+          <w:bCs/>
+        </w:rPr>
+        <w:t>tabla intermedia</w:t>
+      </w:r>
+      <w:r>
+        <w:t xml:space="preserve"> que represente el contrato viviente entre el usuario y su plan.</w:t>
+      </w:r>
+    </w:p>
+    <w:p>
+      <w:pPr>
+        <w:pStyle w:val="Ttulo3"/>
+      </w:pPr>
+      <w:r>
+        <w:t xml:space="preserve">3. Tabla: </w:t>
+      </w:r>
+      <w:r>
+        <w:rPr>
+          <w:rStyle w:val="CdigoHTML"/>
+          <w:rFonts w:eastAsiaTheme="majorEastAsia"/>
+        </w:rPr>
+        <w:t>suscripciones</w:t>
+      </w:r>
+      <w:r>
+        <w:t xml:space="preserve"> (El Contrato)</w:t>
+      </w:r>
+    </w:p>
+    <w:p>
+      <w:pPr>
+        <w:pStyle w:val="NormalWeb"/>
+      </w:pPr>
+      <w:r>
+        <w:t xml:space="preserve">Esta tabla une a un </w:t>
+      </w:r>
+      <w:r>
+        <w:rPr>
+          <w:rStyle w:val="CdigoHTML"/>
+          <w:rFonts w:eastAsiaTheme="majorEastAsia"/>
+        </w:rPr>
+        <w:t>usuario</w:t>
+      </w:r>
+      <w:r>
+        <w:t xml:space="preserve"> con un </w:t>
+      </w:r>
+      <w:r>
+        <w:rPr>
+          <w:rStyle w:val="CdigoHTML"/>
+          <w:rFonts w:eastAsiaTheme="majorEastAsia"/>
+        </w:rPr>
+        <w:t>plan</w:t>
+      </w:r>
+      <w:r>
+        <w:t xml:space="preserve"> y vigila las fechas de validez.</w:t>
+      </w:r>
+    </w:p>
+    <w:p>
+      <w:pPr>
+        <w:pStyle w:val="NormalWeb"/>
+        <w:numPr>
+          <w:ilvl w:val="0"/>
+          <w:numId w:val="19"/>
+        </w:numPr>
+        <w:rPr>
+          <w:lang w:val="en-CA"/>
+        </w:rPr>
+      </w:pPr>
+      <w:r>
+        <w:rPr>
+          <w:rStyle w:val="CdigoHTML"/>
+          <w:rFonts w:eastAsiaTheme="majorEastAsia"/>
+          <w:b/>
+          <w:bCs/>
+          <w:lang w:val="en-CA"/>
+        </w:rPr>
+        <w:t>id</w:t>
+      </w:r>
+      <w:r>
+        <w:rPr>
+          <w:lang w:val="en-CA"/>
+        </w:rPr>
+        <w:t xml:space="preserve"> (BIGINT, Primary Key, Auto-increment).</w:t>
+      </w:r>
+    </w:p>
+    <w:p>
+      <w:pPr>
+        <w:pStyle w:val="NormalWeb"/>
+        <w:numPr>
+          <w:ilvl w:val="0"/>
+          <w:numId w:val="19"/>
+        </w:numPr>
+      </w:pPr>
+      <w:proofErr w:type="spellStart"/>
+      <w:r>
+        <w:rPr>
+          <w:rStyle w:val="CdigoHTML"/>
+          <w:rFonts w:eastAsiaTheme="majorEastAsia"/>
+          <w:b/>
+          <w:bCs/>
+        </w:rPr>
+        <w:t>usuario_id</w:t>
+      </w:r>
+      <w:proofErr w:type="spellEnd"/>
+      <w:r>
+        <w:t xml:space="preserve"> (BIGINT, </w:t>
+      </w:r>
+      <w:proofErr w:type="spellStart"/>
+      <w:r>
+        <w:t>Foreign</w:t>
+      </w:r>
+      <w:proofErr w:type="spellEnd"/>
+      <w:r>
+        <w:t xml:space="preserve"> Key): Apunta al </w:t>
+      </w:r>
+      <w:r>
+        <w:rPr>
+          <w:rStyle w:val="CdigoHTML"/>
+          <w:rFonts w:eastAsiaTheme="majorEastAsia"/>
+        </w:rPr>
+        <w:t>id</w:t>
+      </w:r>
+      <w:r>
+        <w:t xml:space="preserve"> de la tabla </w:t>
+      </w:r>
+      <w:r>
+        <w:rPr>
+          <w:rStyle w:val="CdigoHTML"/>
+          <w:rFonts w:eastAsiaTheme="majorEastAsia"/>
+        </w:rPr>
+        <w:t>usuarios</w:t>
+      </w:r>
+      <w:r>
+        <w:t>.</w:t>
+      </w:r>
+    </w:p>
+    <w:p>
+      <w:pPr>
+        <w:pStyle w:val="NormalWeb"/>
+        <w:numPr>
+          <w:ilvl w:val="0"/>
+          <w:numId w:val="19"/>
+        </w:numPr>
+      </w:pPr>
+      <w:proofErr w:type="spellStart"/>
+      <w:r>
+        <w:rPr>
+          <w:rStyle w:val="CdigoHTML"/>
+          <w:rFonts w:eastAsiaTheme="majorEastAsia"/>
+          <w:b/>
+          <w:bCs/>
+        </w:rPr>
+        <w:t>plan_id</w:t>
+      </w:r>
+      <w:proofErr w:type="spellEnd"/>
+      <w:r>
+        <w:t xml:space="preserve"> (BIGINT, </w:t>
+      </w:r>
+      <w:proofErr w:type="spellStart"/>
+      <w:r>
+        <w:t>Foreign</w:t>
+      </w:r>
+      <w:proofErr w:type="spellEnd"/>
+      <w:r>
+        <w:t xml:space="preserve"> Key): Apunta al </w:t>
+      </w:r>
+      <w:r>
+        <w:rPr>
+          <w:rStyle w:val="CdigoHTML"/>
+          <w:rFonts w:eastAsiaTheme="majorEastAsia"/>
+        </w:rPr>
+        <w:t>id</w:t>
+      </w:r>
+      <w:r>
+        <w:t xml:space="preserve"> de la tabla </w:t>
+      </w:r>
+      <w:r>
+        <w:rPr>
+          <w:rStyle w:val="CdigoHTML"/>
+          <w:rFonts w:eastAsiaTheme="majorEastAsia"/>
+        </w:rPr>
+        <w:t>planes</w:t>
+      </w:r>
+      <w:r>
+        <w:t>.</w:t>
+      </w:r>
+    </w:p>
+    <w:p>
+      <w:pPr>
+        <w:pStyle w:val="NormalWeb"/>
+        <w:numPr>
+          <w:ilvl w:val="1"/>
+          <w:numId w:val="19"/>
+        </w:numPr>
+      </w:pPr>
+      <w:r>
+        <w:rPr>
+          <w:i/>
+          <w:iCs/>
+        </w:rPr>
+        <w:t xml:space="preserve">¿Por qué </w:t>
+      </w:r>
+      <w:proofErr w:type="spellStart"/>
+      <w:r>
+        <w:rPr>
+          <w:i/>
+          <w:iCs/>
+        </w:rPr>
+        <w:t>Foreign</w:t>
+      </w:r>
+      <w:proofErr w:type="spellEnd"/>
+      <w:r>
+        <w:rPr>
+          <w:i/>
+          <w:iCs/>
+        </w:rPr>
+        <w:t xml:space="preserve"> </w:t>
+      </w:r>
+      <w:proofErr w:type="spellStart"/>
+      <w:r>
+        <w:rPr>
+          <w:i/>
+          <w:iCs/>
+        </w:rPr>
+        <w:t>Keys</w:t>
+      </w:r>
+      <w:proofErr w:type="spellEnd"/>
+      <w:r>
+        <w:rPr>
+          <w:i/>
+          <w:iCs/>
+        </w:rPr>
+        <w:t xml:space="preserve"> (Claves Foráneas)?</w:t>
+      </w:r>
+      <w:r>
+        <w:t xml:space="preserve"> Porque garantizan la </w:t>
+      </w:r>
+      <w:r>
+        <w:rPr>
+          <w:b/>
+          <w:bCs/>
+        </w:rPr>
+        <w:t>Integridad Referencial</w:t>
+      </w:r>
+      <w:r>
+        <w:t xml:space="preserve">. Si </w:t>
+      </w:r>
+      <w:proofErr w:type="spellStart"/>
+      <w:r>
+        <w:t>intentás</w:t>
+      </w:r>
+      <w:proofErr w:type="spellEnd"/>
+      <w:r>
+        <w:t xml:space="preserve"> crear una suscripción para el </w:t>
+      </w:r>
+      <w:proofErr w:type="spellStart"/>
+      <w:r>
+        <w:rPr>
+          <w:rStyle w:val="CdigoHTML"/>
+          <w:rFonts w:eastAsiaTheme="majorEastAsia"/>
+        </w:rPr>
+        <w:t>usuario_id</w:t>
+      </w:r>
+      <w:proofErr w:type="spellEnd"/>
+      <w:r>
+        <w:rPr>
+          <w:rStyle w:val="CdigoHTML"/>
+          <w:rFonts w:eastAsiaTheme="majorEastAsia"/>
+        </w:rPr>
+        <w:t xml:space="preserve"> = 99</w:t>
+      </w:r>
+      <w:r>
+        <w:t xml:space="preserve"> y ese usuario no existe en la tabla </w:t>
+      </w:r>
+      <w:r>
+        <w:rPr>
+          <w:rStyle w:val="CdigoHTML"/>
+          <w:rFonts w:eastAsiaTheme="majorEastAsia"/>
+        </w:rPr>
+        <w:t>usuarios</w:t>
+      </w:r>
+      <w:r>
+        <w:t>, MySQL va a rechazar la operación con un error, protegiendo al sistema de datos basura.</w:t>
+      </w:r>
+    </w:p>
+    <w:p>
+      <w:pPr>
+        <w:pStyle w:val="NormalWeb"/>
+        <w:numPr>
+          <w:ilvl w:val="0"/>
+          <w:numId w:val="19"/>
+        </w:numPr>
+      </w:pPr>
+      <w:r>
+        <w:rPr>
+          <w:rStyle w:val="CdigoHTML"/>
+          <w:rFonts w:eastAsiaTheme="majorEastAsia"/>
+          <w:b/>
+          <w:bCs/>
+        </w:rPr>
+        <w:t>estado</w:t>
+      </w:r>
+      <w:r>
+        <w:t xml:space="preserve"> (</w:t>
+      </w:r>
+      <w:proofErr w:type="gramStart"/>
+      <w:r>
+        <w:t>VARCHAR(</w:t>
+      </w:r>
+      <w:proofErr w:type="gramEnd"/>
+      <w:r>
+        <w:t xml:space="preserve">20)): Guardará estados fijos: </w:t>
+      </w:r>
+      <w:r>
+        <w:rPr>
+          <w:rStyle w:val="CdigoHTML"/>
+          <w:rFonts w:eastAsiaTheme="majorEastAsia"/>
+        </w:rPr>
+        <w:t>ACTIVO</w:t>
+      </w:r>
+      <w:r>
+        <w:t xml:space="preserve">, </w:t>
+      </w:r>
+      <w:r>
+        <w:rPr>
+          <w:rStyle w:val="CdigoHTML"/>
+          <w:rFonts w:eastAsiaTheme="majorEastAsia"/>
+        </w:rPr>
+        <w:t>MOROSO</w:t>
+      </w:r>
+      <w:r>
+        <w:t xml:space="preserve">, </w:t>
+      </w:r>
+      <w:r>
+        <w:rPr>
+          <w:rStyle w:val="CdigoHTML"/>
+          <w:rFonts w:eastAsiaTheme="majorEastAsia"/>
+        </w:rPr>
+        <w:t>CANCELADO</w:t>
+      </w:r>
+      <w:r>
+        <w:t xml:space="preserve">. (Más adelante en Java esto mapeará a un </w:t>
+      </w:r>
+      <w:proofErr w:type="spellStart"/>
+      <w:r>
+        <w:rPr>
+          <w:rStyle w:val="CdigoHTML"/>
+          <w:rFonts w:eastAsiaTheme="majorEastAsia"/>
+        </w:rPr>
+        <w:t>Enum</w:t>
+      </w:r>
+      <w:proofErr w:type="spellEnd"/>
+      <w:r>
+        <w:t>).</w:t>
+      </w:r>
+    </w:p>
+    <w:p>
+      <w:pPr>
+        <w:pStyle w:val="NormalWeb"/>
+        <w:numPr>
+          <w:ilvl w:val="0"/>
+          <w:numId w:val="19"/>
+        </w:numPr>
+      </w:pPr>
+      <w:proofErr w:type="spellStart"/>
+      <w:r>
+        <w:rPr>
+          <w:rStyle w:val="CdigoHTML"/>
+          <w:rFonts w:eastAsiaTheme="majorEastAsia"/>
+          <w:b/>
+          <w:bCs/>
+        </w:rPr>
+        <w:t>fecha_inicio</w:t>
+      </w:r>
+      <w:proofErr w:type="spellEnd"/>
+      <w:r>
+        <w:t xml:space="preserve"> (DATE): Cuándo empezó a correr la suscripción actual.</w:t>
+      </w:r>
+    </w:p>
+    <w:p>
+      <w:pPr>
+        <w:pStyle w:val="NormalWeb"/>
+        <w:numPr>
+          <w:ilvl w:val="0"/>
+          <w:numId w:val="19"/>
+        </w:numPr>
+      </w:pPr>
+      <w:proofErr w:type="spellStart"/>
+      <w:r>
+        <w:rPr>
+          <w:rStyle w:val="CdigoHTML"/>
+          <w:rFonts w:eastAsiaTheme="majorEastAsia"/>
+          <w:b/>
+          <w:bCs/>
+        </w:rPr>
+        <w:t>fecha_vencimiento</w:t>
+      </w:r>
+      <w:proofErr w:type="spellEnd"/>
+      <w:r>
+        <w:t xml:space="preserve"> (DATE): Cuándo se termina el período pago (normalmente </w:t>
+      </w:r>
+      <w:proofErr w:type="spellStart"/>
+      <w:r>
+        <w:rPr>
+          <w:rStyle w:val="CdigoHTML"/>
+          <w:rFonts w:eastAsiaTheme="majorEastAsia"/>
+        </w:rPr>
+        <w:t>fecha_inicio</w:t>
+      </w:r>
+      <w:proofErr w:type="spellEnd"/>
+      <w:r>
+        <w:t xml:space="preserve"> + 30 días). El </w:t>
+      </w:r>
+      <w:proofErr w:type="spellStart"/>
+      <w:r>
+        <w:t>backend</w:t>
+      </w:r>
+      <w:proofErr w:type="spellEnd"/>
+      <w:r>
+        <w:t xml:space="preserve"> usará esta fecha exacta para decidir si bloquea o no al usuario.</w:t>
+      </w:r>
+    </w:p>
+    <w:p>
+      <w:pPr>
+        <w:pStyle w:val="Ttulo3"/>
+      </w:pPr>
+      <w:r>
+        <w:t xml:space="preserve">4. Tabla: </w:t>
+      </w:r>
+      <w:r>
+        <w:rPr>
+          <w:rStyle w:val="CdigoHTML"/>
+          <w:rFonts w:eastAsiaTheme="majorEastAsia"/>
+        </w:rPr>
+        <w:t>facturas</w:t>
+      </w:r>
+      <w:r>
+        <w:t xml:space="preserve"> (El Historial Financiero)</w:t>
+      </w:r>
+    </w:p>
+    <w:p>
+      <w:pPr>
+        <w:pStyle w:val="NormalWeb"/>
+      </w:pPr>
+      <w:r>
+        <w:t>Cada vez que un usuario paga o se le genera un cobro mensual (incluso si falla), se registra acá.</w:t>
+      </w:r>
+    </w:p>
+    <w:p>
+      <w:pPr>
+        <w:pStyle w:val="NormalWeb"/>
+        <w:numPr>
+          <w:ilvl w:val="0"/>
+          <w:numId w:val="20"/>
+        </w:numPr>
+        <w:rPr>
+          <w:lang w:val="en-CA"/>
+        </w:rPr>
+      </w:pPr>
+      <w:r>
+        <w:rPr>
+          <w:rStyle w:val="CdigoHTML"/>
+          <w:rFonts w:eastAsiaTheme="majorEastAsia"/>
+          <w:b/>
+          <w:bCs/>
+          <w:lang w:val="en-CA"/>
+        </w:rPr>
+        <w:t>id</w:t>
+      </w:r>
+      <w:r>
+        <w:rPr>
+          <w:lang w:val="en-CA"/>
+        </w:rPr>
+        <w:t xml:space="preserve"> (BIGINT, Primary Key, Auto-increment).</w:t>
+      </w:r>
+    </w:p>
+    <w:p>
+      <w:pPr>
+        <w:pStyle w:val="NormalWeb"/>
+        <w:numPr>
+          <w:ilvl w:val="0"/>
+          <w:numId w:val="20"/>
+        </w:numPr>
+      </w:pPr>
+      <w:proofErr w:type="spellStart"/>
+      <w:r>
+        <w:rPr>
+          <w:rStyle w:val="CdigoHTML"/>
+          <w:rFonts w:eastAsiaTheme="majorEastAsia"/>
+          <w:b/>
+          <w:bCs/>
+        </w:rPr>
+        <w:t>suscripcion_id</w:t>
+      </w:r>
+      <w:proofErr w:type="spellEnd"/>
+      <w:r>
+        <w:t xml:space="preserve"> (BIGINT, </w:t>
+      </w:r>
+      <w:proofErr w:type="spellStart"/>
+      <w:r>
+        <w:t>Foreign</w:t>
+      </w:r>
+      <w:proofErr w:type="spellEnd"/>
+      <w:r>
+        <w:t xml:space="preserve"> Key): Relaciona la factura con la suscripción correspondiente.</w:t>
+      </w:r>
+    </w:p>
+    <w:p>
+      <w:pPr>
+        <w:pStyle w:val="NormalWeb"/>
+        <w:numPr>
+          <w:ilvl w:val="0"/>
+          <w:numId w:val="20"/>
+        </w:numPr>
+      </w:pPr>
+      <w:r>
+        <w:rPr>
+          <w:rStyle w:val="CdigoHTML"/>
+          <w:rFonts w:eastAsiaTheme="majorEastAsia"/>
+          <w:b/>
+          <w:bCs/>
+        </w:rPr>
+        <w:t>monto</w:t>
+      </w:r>
+      <w:r>
+        <w:t xml:space="preserve"> (</w:t>
+      </w:r>
+      <w:proofErr w:type="gramStart"/>
+      <w:r>
+        <w:t>DECIMAL(</w:t>
+      </w:r>
+      <w:proofErr w:type="gramEnd"/>
+      <w:r>
+        <w:t>10,2)): El total cobrado.</w:t>
+      </w:r>
+    </w:p>
+    <w:p>
+      <w:pPr>
+        <w:pStyle w:val="NormalWeb"/>
+        <w:numPr>
+          <w:ilvl w:val="0"/>
+          <w:numId w:val="20"/>
+        </w:numPr>
+      </w:pPr>
+      <w:proofErr w:type="spellStart"/>
+      <w:r>
+        <w:rPr>
+          <w:rStyle w:val="CdigoHTML"/>
+          <w:rFonts w:eastAsiaTheme="majorEastAsia"/>
+          <w:b/>
+          <w:bCs/>
+        </w:rPr>
+        <w:t>fecha_emision</w:t>
+      </w:r>
+      <w:proofErr w:type="spellEnd"/>
+      <w:r>
+        <w:t xml:space="preserve"> (TIMESTAMP): Cuándo se generó el cobro.</w:t>
+      </w:r>
+    </w:p>
+    <w:p>
+      <w:pPr>
+        <w:pStyle w:val="NormalWeb"/>
+        <w:numPr>
+          <w:ilvl w:val="0"/>
+          <w:numId w:val="20"/>
+        </w:numPr>
+      </w:pPr>
+      <w:proofErr w:type="spellStart"/>
+      <w:r>
+        <w:rPr>
+          <w:rStyle w:val="CdigoHTML"/>
+          <w:rFonts w:eastAsiaTheme="majorEastAsia"/>
+          <w:b/>
+          <w:bCs/>
+        </w:rPr>
+        <w:t>estado_pago</w:t>
+      </w:r>
+      <w:proofErr w:type="spellEnd"/>
+      <w:r>
+        <w:t xml:space="preserve"> (</w:t>
+      </w:r>
+      <w:proofErr w:type="gramStart"/>
+      <w:r>
+        <w:t>VARCHAR(</w:t>
+      </w:r>
+      <w:proofErr w:type="gramEnd"/>
+      <w:r>
+        <w:t xml:space="preserve">20)): </w:t>
+      </w:r>
+      <w:r>
+        <w:rPr>
+          <w:rStyle w:val="CdigoHTML"/>
+          <w:rFonts w:eastAsiaTheme="majorEastAsia"/>
+        </w:rPr>
+        <w:t>PAGADA</w:t>
+      </w:r>
+      <w:r>
+        <w:t xml:space="preserve">, </w:t>
+      </w:r>
+      <w:r>
+        <w:rPr>
+          <w:rStyle w:val="CdigoHTML"/>
+          <w:rFonts w:eastAsiaTheme="majorEastAsia"/>
+        </w:rPr>
+        <w:t>PENDIENTE</w:t>
+      </w:r>
+      <w:r>
+        <w:t xml:space="preserve">, </w:t>
+      </w:r>
+      <w:r>
+        <w:rPr>
+          <w:rStyle w:val="CdigoHTML"/>
+          <w:rFonts w:eastAsiaTheme="majorEastAsia"/>
+        </w:rPr>
+        <w:t>RECHAZADA</w:t>
+      </w:r>
+      <w:r>
+        <w:t>.</w:t>
+      </w:r>
+    </w:p>
+    <w:p>
+      <w:pPr>
+        <w:pStyle w:val="Ttulo2"/>
+      </w:pPr>
+      <w:r>
+        <w:rPr>
+          <w:rFonts w:ascii="Segoe UI Emoji" w:hAnsi="Segoe UI Emoji" w:cs="Segoe UI Emoji"/>
+        </w:rPr>
+        <w:t>🗺</w:t>
+      </w:r>
+      <w:r>
+        <w:t>️ El Mapa de Relaciones (Diagrama Mental)</w:t>
+      </w:r>
+    </w:p>
+    <w:p>
+      <w:pPr>
+        <w:pStyle w:val="NormalWeb"/>
+        <w:numPr>
+          <w:ilvl w:val="0"/>
+          <w:numId w:val="21"/>
+        </w:numPr>
+      </w:pPr>
+      <w:r>
+        <w:rPr>
+          <w:b/>
+          <w:bCs/>
+        </w:rPr>
+        <w:t>Usuarios (1) ------&gt; (N) Suscripciones:</w:t>
+      </w:r>
+      <w:r>
+        <w:t xml:space="preserve"> Un usuario puede tener muchas suscripciones a lo largo de su vida en la plataforma (una sola activa a la vez).</w:t>
+      </w:r>
+    </w:p>
+    <w:p>
+      <w:pPr>
+        <w:pStyle w:val="NormalWeb"/>
+        <w:numPr>
+          <w:ilvl w:val="0"/>
+          <w:numId w:val="21"/>
+        </w:numPr>
+      </w:pPr>
+      <w:r>
+        <w:rPr>
+          <w:b/>
+          <w:bCs/>
+        </w:rPr>
+        <w:t>Planes (1) ------&gt; (N) Suscripciones:</w:t>
+      </w:r>
+      <w:r>
+        <w:t xml:space="preserve"> Un plan puede estar asignado a muchas suscripciones de distintos clientes.</w:t>
+      </w:r>
+    </w:p>
+    <w:p>
+      <w:pPr>
+        <w:pStyle w:val="NormalWeb"/>
+        <w:numPr>
+          <w:ilvl w:val="0"/>
+          <w:numId w:val="21"/>
+        </w:numPr>
+      </w:pPr>
+      <w:r>
+        <w:rPr>
+          <w:b/>
+          <w:bCs/>
+        </w:rPr>
+        <w:t>Suscripciones (1) ------&gt; (N) Facturas:</w:t>
+      </w:r>
+      <w:r>
+        <w:t xml:space="preserve"> Una suscripción vigente va a generar una factura nueva cada mes que pase.</w:t>
       </w:r>
     </w:p>
     <w:p/>
@@ -3352,7 +4696,7 @@
 </file>
 
 <file path=word/numbering.xml><?xml version="1.0" encoding="utf-8"?>
-<w:numbering xmlns:wpc="http://schemas.microsoft.com/office/word/2010/wordprocessingCanvas" xmlns:cx="http://schemas.microsoft.com/office/drawing/2014/chartex" xmlns:cx1="http://schemas.microsoft.com/office/drawing/2015/9/8/chartex" xmlns:cx2="http://schemas.microsoft.com/office/drawing/2015/10/21/chartex" xmlns:cx3="http://schemas.microsoft.com/office/drawing/2016/5/9/chartex" xmlns:cx4="http://schemas.microsoft.com/office/drawing/2016/5/10/chartex" xmlns:cx5="http://schemas.microsoft.com/office/drawing/2016/5/11/chartex" xmlns:cx6="http://schemas.microsoft.com/office/drawing/2016/5/12/chartex" xmlns:cx7="http://schemas.microsoft.com/office/drawing/2016/5/13/chartex" xmlns:cx8="http://schemas.microsoft.com/office/drawing/2016/5/14/chartex" xmlns:mc="http://schemas.openxmlformats.org/markup-compatibility/2006" xmlns:aink="http://schemas.microsoft.com/office/drawing/2016/ink" xmlns:am3d="http://schemas.microsoft.com/office/drawing/2017/model3d" xmlns:o="urn:schemas-microsoft-com:office:office" xmlns:oel="http://schemas.microsoft.com/office/2019/extlst" xmlns:r="http://schemas.openxmlformats.org/officeDocument/2006/relationships" xmlns:m="http://schemas.openxmlformats.org/officeDocument/2006/math" xmlns:v="urn:schemas-microsoft-com:vml" xmlns:wp14="http://schemas.microsoft.com/office/word/2010/wordprocessingDrawing" xmlns:wp="http://schemas.openxmlformats.org/drawingml/2006/wordprocessingDrawing" xmlns:w10="urn:schemas-microsoft-com:office:word" xmlns:w="http://schemas.openxmlformats.org/wordprocessingml/2006/main" xmlns:w14="http://schemas.microsoft.com/office/word/2010/wordml" xmlns:w15="http://schemas.microsoft.com/office/word/2012/wordml" xmlns:w16cex="http://schemas.microsoft.com/office/word/2018/wordml/cex" xmlns:w16cid="http://schemas.microsoft.com/office/word/2016/wordml/cid" xmlns:w16="http://schemas.microsoft.com/office/word/2018/wordml" xmlns:w16du="http://schemas.microsoft.com/office/word/2023/wordml/word16du" xmlns:w16sdtdh="http://schemas.microsoft.com/office/word/2020/wordml/sdtdatahash" xmlns:w16sdtfl="http://schemas.microsoft.com/office/word/2024/wordml/sdtformatlock" xmlns:w16se="http://schemas.microsoft.com/office/word/2015/wordml/symex" xmlns:wpg="http://schemas.microsoft.com/office/word/2010/wordprocessingGroup" xmlns:wpi="http://schemas.microsoft.com/office/word/2010/wordprocessingInk" xmlns:wne="http://schemas.microsoft.com/office/word/2006/wordml" xmlns:wps="http://schemas.microsoft.com/office/word/2010/wordprocessingShape" mc:Ignorable="w14 w15 w16se w16cid w16 w16cex w16sdtdh w16sdtfl w16du wp14">
+<w:numbering xmlns:wpc="http://schemas.microsoft.com/office/word/2010/wordprocessingCanvas" xmlns:cx="http://schemas.microsoft.com/office/drawing/2014/chartex" xmlns:cx1="http://schemas.microsoft.com/office/drawing/2015/9/8/chartex" xmlns:cx2="http://schemas.microsoft.com/office/drawing/2015/10/21/chartex" xmlns:cx3="http://schemas.microsoft.com/office/drawing/2016/5/9/chartex" xmlns:cx4="http://schemas.microsoft.com/office/drawing/2016/5/10/chartex" xmlns:cx5="http://schemas.microsoft.com/office/drawing/2016/5/11/chartex" xmlns:cx6="http://schemas.microsoft.com/office/drawing/2016/5/12/chartex" xmlns:cx7="http://schemas.microsoft.com/office/drawing/2016/5/13/chartex" xmlns:cx8="http://schemas.microsoft.com/office/drawing/2016/5/14/chartex" xmlns:mc="http://schemas.openxmlformats.org/markup-compatibility/2006" xmlns:aink="http://schemas.microsoft.com/office/drawing/2016/ink" xmlns:am3d="http://schemas.microsoft.com/office/drawing/2017/model3d" xmlns:o="urn:schemas-microsoft-com:office:office" xmlns:r="http://schemas.openxmlformats.org/officeDocument/2006/relationships" xmlns:m="http://schemas.openxmlformats.org/officeDocument/2006/math" xmlns:v="urn:schemas-microsoft-com:vml" xmlns:wp14="http://schemas.microsoft.com/office/word/2010/wordprocessingDrawing" xmlns:wp="http://schemas.openxmlformats.org/drawingml/2006/wordprocessingDrawing" xmlns:w10="urn:schemas-microsoft-com:office:word" xmlns:w="http://schemas.openxmlformats.org/wordprocessingml/2006/main" xmlns:w14="http://schemas.microsoft.com/office/word/2010/wordml" xmlns:w15="http://schemas.microsoft.com/office/word/2012/wordml" xmlns:w16cex="http://schemas.microsoft.com/office/word/2018/wordml/cex" xmlns:w16cid="http://schemas.microsoft.com/office/word/2016/wordml/cid" xmlns:w16="http://schemas.microsoft.com/office/word/2018/wordml" xmlns:w16sdtdh="http://schemas.microsoft.com/office/word/2020/wordml/sdtdatahash" xmlns:w16se="http://schemas.microsoft.com/office/word/2015/wordml/symex" xmlns:wpg="http://schemas.microsoft.com/office/word/2010/wordprocessingGroup" xmlns:wpi="http://schemas.microsoft.com/office/word/2010/wordprocessingInk" xmlns:wne="http://schemas.microsoft.com/office/word/2006/wordml" xmlns:wps="http://schemas.microsoft.com/office/word/2010/wordprocessingShape" mc:Ignorable="w14 w15 w16se w16cid w16 w16cex w16sdtdh wp14">
   <w:abstractNum w:abstractNumId="0" w15:restartNumberingAfterBreak="0">
     <w:nsid w:val="089F6E02"/>
     <w:multiLevelType w:val="multilevel"/>
@@ -4063,6 +5407,304 @@
     </w:lvl>
   </w:abstractNum>
   <w:abstractNum w:abstractNumId="5" w15:restartNumberingAfterBreak="0">
+    <w:nsid w:val="13A90196"/>
+    <w:multiLevelType w:val="multilevel"/>
+    <w:tmpl w:val="259E7DDA"/>
+    <w:lvl w:ilvl="0">
+      <w:start w:val="1"/>
+      <w:numFmt w:val="bullet"/>
+      <w:lvlText w:val=""/>
+      <w:lvlJc w:val="left"/>
+      <w:pPr>
+        <w:tabs>
+          <w:tab w:val="num" w:pos="720"/>
+        </w:tabs>
+        <w:ind w:left="720" w:hanging="360"/>
+      </w:pPr>
+      <w:rPr>
+        <w:rFonts w:ascii="Symbol" w:hAnsi="Symbol" w:hint="default"/>
+        <w:sz w:val="20"/>
+      </w:rPr>
+    </w:lvl>
+    <w:lvl w:ilvl="1">
+      <w:start w:val="1"/>
+      <w:numFmt w:val="bullet"/>
+      <w:lvlText w:val="o"/>
+      <w:lvlJc w:val="left"/>
+      <w:pPr>
+        <w:tabs>
+          <w:tab w:val="num" w:pos="1440"/>
+        </w:tabs>
+        <w:ind w:left="1440" w:hanging="360"/>
+      </w:pPr>
+      <w:rPr>
+        <w:rFonts w:ascii="Courier New" w:hAnsi="Courier New" w:hint="default"/>
+        <w:sz w:val="20"/>
+      </w:rPr>
+    </w:lvl>
+    <w:lvl w:ilvl="2" w:tentative="1">
+      <w:start w:val="1"/>
+      <w:numFmt w:val="bullet"/>
+      <w:lvlText w:val=""/>
+      <w:lvlJc w:val="left"/>
+      <w:pPr>
+        <w:tabs>
+          <w:tab w:val="num" w:pos="2160"/>
+        </w:tabs>
+        <w:ind w:left="2160" w:hanging="360"/>
+      </w:pPr>
+      <w:rPr>
+        <w:rFonts w:ascii="Wingdings" w:hAnsi="Wingdings" w:hint="default"/>
+        <w:sz w:val="20"/>
+      </w:rPr>
+    </w:lvl>
+    <w:lvl w:ilvl="3" w:tentative="1">
+      <w:start w:val="1"/>
+      <w:numFmt w:val="bullet"/>
+      <w:lvlText w:val=""/>
+      <w:lvlJc w:val="left"/>
+      <w:pPr>
+        <w:tabs>
+          <w:tab w:val="num" w:pos="2880"/>
+        </w:tabs>
+        <w:ind w:left="2880" w:hanging="360"/>
+      </w:pPr>
+      <w:rPr>
+        <w:rFonts w:ascii="Wingdings" w:hAnsi="Wingdings" w:hint="default"/>
+        <w:sz w:val="20"/>
+      </w:rPr>
+    </w:lvl>
+    <w:lvl w:ilvl="4" w:tentative="1">
+      <w:start w:val="1"/>
+      <w:numFmt w:val="bullet"/>
+      <w:lvlText w:val=""/>
+      <w:lvlJc w:val="left"/>
+      <w:pPr>
+        <w:tabs>
+          <w:tab w:val="num" w:pos="3600"/>
+        </w:tabs>
+        <w:ind w:left="3600" w:hanging="360"/>
+      </w:pPr>
+      <w:rPr>
+        <w:rFonts w:ascii="Wingdings" w:hAnsi="Wingdings" w:hint="default"/>
+        <w:sz w:val="20"/>
+      </w:rPr>
+    </w:lvl>
+    <w:lvl w:ilvl="5" w:tentative="1">
+      <w:start w:val="1"/>
+      <w:numFmt w:val="bullet"/>
+      <w:lvlText w:val=""/>
+      <w:lvlJc w:val="left"/>
+      <w:pPr>
+        <w:tabs>
+          <w:tab w:val="num" w:pos="4320"/>
+        </w:tabs>
+        <w:ind w:left="4320" w:hanging="360"/>
+      </w:pPr>
+      <w:rPr>
+        <w:rFonts w:ascii="Wingdings" w:hAnsi="Wingdings" w:hint="default"/>
+        <w:sz w:val="20"/>
+      </w:rPr>
+    </w:lvl>
+    <w:lvl w:ilvl="6" w:tentative="1">
+      <w:start w:val="1"/>
+      <w:numFmt w:val="bullet"/>
+      <w:lvlText w:val=""/>
+      <w:lvlJc w:val="left"/>
+      <w:pPr>
+        <w:tabs>
+          <w:tab w:val="num" w:pos="5040"/>
+        </w:tabs>
+        <w:ind w:left="5040" w:hanging="360"/>
+      </w:pPr>
+      <w:rPr>
+        <w:rFonts w:ascii="Wingdings" w:hAnsi="Wingdings" w:hint="default"/>
+        <w:sz w:val="20"/>
+      </w:rPr>
+    </w:lvl>
+    <w:lvl w:ilvl="7" w:tentative="1">
+      <w:start w:val="1"/>
+      <w:numFmt w:val="bullet"/>
+      <w:lvlText w:val=""/>
+      <w:lvlJc w:val="left"/>
+      <w:pPr>
+        <w:tabs>
+          <w:tab w:val="num" w:pos="5760"/>
+        </w:tabs>
+        <w:ind w:left="5760" w:hanging="360"/>
+      </w:pPr>
+      <w:rPr>
+        <w:rFonts w:ascii="Wingdings" w:hAnsi="Wingdings" w:hint="default"/>
+        <w:sz w:val="20"/>
+      </w:rPr>
+    </w:lvl>
+    <w:lvl w:ilvl="8" w:tentative="1">
+      <w:start w:val="1"/>
+      <w:numFmt w:val="bullet"/>
+      <w:lvlText w:val=""/>
+      <w:lvlJc w:val="left"/>
+      <w:pPr>
+        <w:tabs>
+          <w:tab w:val="num" w:pos="6480"/>
+        </w:tabs>
+        <w:ind w:left="6480" w:hanging="360"/>
+      </w:pPr>
+      <w:rPr>
+        <w:rFonts w:ascii="Wingdings" w:hAnsi="Wingdings" w:hint="default"/>
+        <w:sz w:val="20"/>
+      </w:rPr>
+    </w:lvl>
+  </w:abstractNum>
+  <w:abstractNum w:abstractNumId="6" w15:restartNumberingAfterBreak="0">
+    <w:nsid w:val="1FB11247"/>
+    <w:multiLevelType w:val="multilevel"/>
+    <w:tmpl w:val="AE0CB120"/>
+    <w:lvl w:ilvl="0">
+      <w:start w:val="1"/>
+      <w:numFmt w:val="bullet"/>
+      <w:lvlText w:val=""/>
+      <w:lvlJc w:val="left"/>
+      <w:pPr>
+        <w:tabs>
+          <w:tab w:val="num" w:pos="720"/>
+        </w:tabs>
+        <w:ind w:left="720" w:hanging="360"/>
+      </w:pPr>
+      <w:rPr>
+        <w:rFonts w:ascii="Symbol" w:hAnsi="Symbol" w:hint="default"/>
+        <w:sz w:val="20"/>
+      </w:rPr>
+    </w:lvl>
+    <w:lvl w:ilvl="1">
+      <w:start w:val="1"/>
+      <w:numFmt w:val="bullet"/>
+      <w:lvlText w:val="o"/>
+      <w:lvlJc w:val="left"/>
+      <w:pPr>
+        <w:tabs>
+          <w:tab w:val="num" w:pos="1440"/>
+        </w:tabs>
+        <w:ind w:left="1440" w:hanging="360"/>
+      </w:pPr>
+      <w:rPr>
+        <w:rFonts w:ascii="Courier New" w:hAnsi="Courier New" w:hint="default"/>
+        <w:sz w:val="20"/>
+      </w:rPr>
+    </w:lvl>
+    <w:lvl w:ilvl="2" w:tentative="1">
+      <w:start w:val="1"/>
+      <w:numFmt w:val="bullet"/>
+      <w:lvlText w:val=""/>
+      <w:lvlJc w:val="left"/>
+      <w:pPr>
+        <w:tabs>
+          <w:tab w:val="num" w:pos="2160"/>
+        </w:tabs>
+        <w:ind w:left="2160" w:hanging="360"/>
+      </w:pPr>
+      <w:rPr>
+        <w:rFonts w:ascii="Wingdings" w:hAnsi="Wingdings" w:hint="default"/>
+        <w:sz w:val="20"/>
+      </w:rPr>
+    </w:lvl>
+    <w:lvl w:ilvl="3" w:tentative="1">
+      <w:start w:val="1"/>
+      <w:numFmt w:val="bullet"/>
+      <w:lvlText w:val=""/>
+      <w:lvlJc w:val="left"/>
+      <w:pPr>
+        <w:tabs>
+          <w:tab w:val="num" w:pos="2880"/>
+        </w:tabs>
+        <w:ind w:left="2880" w:hanging="360"/>
+      </w:pPr>
+      <w:rPr>
+        <w:rFonts w:ascii="Wingdings" w:hAnsi="Wingdings" w:hint="default"/>
+        <w:sz w:val="20"/>
+      </w:rPr>
+    </w:lvl>
+    <w:lvl w:ilvl="4" w:tentative="1">
+      <w:start w:val="1"/>
+      <w:numFmt w:val="bullet"/>
+      <w:lvlText w:val=""/>
+      <w:lvlJc w:val="left"/>
+      <w:pPr>
+        <w:tabs>
+          <w:tab w:val="num" w:pos="3600"/>
+        </w:tabs>
+        <w:ind w:left="3600" w:hanging="360"/>
+      </w:pPr>
+      <w:rPr>
+        <w:rFonts w:ascii="Wingdings" w:hAnsi="Wingdings" w:hint="default"/>
+        <w:sz w:val="20"/>
+      </w:rPr>
+    </w:lvl>
+    <w:lvl w:ilvl="5" w:tentative="1">
+      <w:start w:val="1"/>
+      <w:numFmt w:val="bullet"/>
+      <w:lvlText w:val=""/>
+      <w:lvlJc w:val="left"/>
+      <w:pPr>
+        <w:tabs>
+          <w:tab w:val="num" w:pos="4320"/>
+        </w:tabs>
+        <w:ind w:left="4320" w:hanging="360"/>
+      </w:pPr>
+      <w:rPr>
+        <w:rFonts w:ascii="Wingdings" w:hAnsi="Wingdings" w:hint="default"/>
+        <w:sz w:val="20"/>
+      </w:rPr>
+    </w:lvl>
+    <w:lvl w:ilvl="6" w:tentative="1">
+      <w:start w:val="1"/>
+      <w:numFmt w:val="bullet"/>
+      <w:lvlText w:val=""/>
+      <w:lvlJc w:val="left"/>
+      <w:pPr>
+        <w:tabs>
+          <w:tab w:val="num" w:pos="5040"/>
+        </w:tabs>
+        <w:ind w:left="5040" w:hanging="360"/>
+      </w:pPr>
+      <w:rPr>
+        <w:rFonts w:ascii="Wingdings" w:hAnsi="Wingdings" w:hint="default"/>
+        <w:sz w:val="20"/>
+      </w:rPr>
+    </w:lvl>
+    <w:lvl w:ilvl="7" w:tentative="1">
+      <w:start w:val="1"/>
+      <w:numFmt w:val="bullet"/>
+      <w:lvlText w:val=""/>
+      <w:lvlJc w:val="left"/>
+      <w:pPr>
+        <w:tabs>
+          <w:tab w:val="num" w:pos="5760"/>
+        </w:tabs>
+        <w:ind w:left="5760" w:hanging="360"/>
+      </w:pPr>
+      <w:rPr>
+        <w:rFonts w:ascii="Wingdings" w:hAnsi="Wingdings" w:hint="default"/>
+        <w:sz w:val="20"/>
+      </w:rPr>
+    </w:lvl>
+    <w:lvl w:ilvl="8" w:tentative="1">
+      <w:start w:val="1"/>
+      <w:numFmt w:val="bullet"/>
+      <w:lvlText w:val=""/>
+      <w:lvlJc w:val="left"/>
+      <w:pPr>
+        <w:tabs>
+          <w:tab w:val="num" w:pos="6480"/>
+        </w:tabs>
+        <w:ind w:left="6480" w:hanging="360"/>
+      </w:pPr>
+      <w:rPr>
+        <w:rFonts w:ascii="Wingdings" w:hAnsi="Wingdings" w:hint="default"/>
+        <w:sz w:val="20"/>
+      </w:rPr>
+    </w:lvl>
+  </w:abstractNum>
+  <w:abstractNum w:abstractNumId="7" w15:restartNumberingAfterBreak="0">
     <w:nsid w:val="21335318"/>
     <w:multiLevelType w:val="multilevel"/>
     <w:tmpl w:val="2A904384"/>
@@ -4175,7 +5817,156 @@
       </w:pPr>
     </w:lvl>
   </w:abstractNum>
-  <w:abstractNum w:abstractNumId="6" w15:restartNumberingAfterBreak="0">
+  <w:abstractNum w:abstractNumId="8" w15:restartNumberingAfterBreak="0">
+    <w:nsid w:val="213A56FE"/>
+    <w:multiLevelType w:val="multilevel"/>
+    <w:tmpl w:val="24CAACAE"/>
+    <w:lvl w:ilvl="0">
+      <w:start w:val="1"/>
+      <w:numFmt w:val="bullet"/>
+      <w:lvlText w:val=""/>
+      <w:lvlJc w:val="left"/>
+      <w:pPr>
+        <w:tabs>
+          <w:tab w:val="num" w:pos="720"/>
+        </w:tabs>
+        <w:ind w:left="720" w:hanging="360"/>
+      </w:pPr>
+      <w:rPr>
+        <w:rFonts w:ascii="Symbol" w:hAnsi="Symbol" w:hint="default"/>
+        <w:sz w:val="20"/>
+      </w:rPr>
+    </w:lvl>
+    <w:lvl w:ilvl="1" w:tentative="1">
+      <w:start w:val="1"/>
+      <w:numFmt w:val="bullet"/>
+      <w:lvlText w:val="o"/>
+      <w:lvlJc w:val="left"/>
+      <w:pPr>
+        <w:tabs>
+          <w:tab w:val="num" w:pos="1440"/>
+        </w:tabs>
+        <w:ind w:left="1440" w:hanging="360"/>
+      </w:pPr>
+      <w:rPr>
+        <w:rFonts w:ascii="Courier New" w:hAnsi="Courier New" w:hint="default"/>
+        <w:sz w:val="20"/>
+      </w:rPr>
+    </w:lvl>
+    <w:lvl w:ilvl="2" w:tentative="1">
+      <w:start w:val="1"/>
+      <w:numFmt w:val="bullet"/>
+      <w:lvlText w:val=""/>
+      <w:lvlJc w:val="left"/>
+      <w:pPr>
+        <w:tabs>
+          <w:tab w:val="num" w:pos="2160"/>
+        </w:tabs>
+        <w:ind w:left="2160" w:hanging="360"/>
+      </w:pPr>
+      <w:rPr>
+        <w:rFonts w:ascii="Wingdings" w:hAnsi="Wingdings" w:hint="default"/>
+        <w:sz w:val="20"/>
+      </w:rPr>
+    </w:lvl>
+    <w:lvl w:ilvl="3" w:tentative="1">
+      <w:start w:val="1"/>
+      <w:numFmt w:val="bullet"/>
+      <w:lvlText w:val=""/>
+      <w:lvlJc w:val="left"/>
+      <w:pPr>
+        <w:tabs>
+          <w:tab w:val="num" w:pos="2880"/>
+        </w:tabs>
+        <w:ind w:left="2880" w:hanging="360"/>
+      </w:pPr>
+      <w:rPr>
+        <w:rFonts w:ascii="Wingdings" w:hAnsi="Wingdings" w:hint="default"/>
+        <w:sz w:val="20"/>
+      </w:rPr>
+    </w:lvl>
+    <w:lvl w:ilvl="4" w:tentative="1">
+      <w:start w:val="1"/>
+      <w:numFmt w:val="bullet"/>
+      <w:lvlText w:val=""/>
+      <w:lvlJc w:val="left"/>
+      <w:pPr>
+        <w:tabs>
+          <w:tab w:val="num" w:pos="3600"/>
+        </w:tabs>
+        <w:ind w:left="3600" w:hanging="360"/>
+      </w:pPr>
+      <w:rPr>
+        <w:rFonts w:ascii="Wingdings" w:hAnsi="Wingdings" w:hint="default"/>
+        <w:sz w:val="20"/>
+      </w:rPr>
+    </w:lvl>
+    <w:lvl w:ilvl="5" w:tentative="1">
+      <w:start w:val="1"/>
+      <w:numFmt w:val="bullet"/>
+      <w:lvlText w:val=""/>
+      <w:lvlJc w:val="left"/>
+      <w:pPr>
+        <w:tabs>
+          <w:tab w:val="num" w:pos="4320"/>
+        </w:tabs>
+        <w:ind w:left="4320" w:hanging="360"/>
+      </w:pPr>
+      <w:rPr>
+        <w:rFonts w:ascii="Wingdings" w:hAnsi="Wingdings" w:hint="default"/>
+        <w:sz w:val="20"/>
+      </w:rPr>
+    </w:lvl>
+    <w:lvl w:ilvl="6" w:tentative="1">
+      <w:start w:val="1"/>
+      <w:numFmt w:val="bullet"/>
+      <w:lvlText w:val=""/>
+      <w:lvlJc w:val="left"/>
+      <w:pPr>
+        <w:tabs>
+          <w:tab w:val="num" w:pos="5040"/>
+        </w:tabs>
+        <w:ind w:left="5040" w:hanging="360"/>
+      </w:pPr>
+      <w:rPr>
+        <w:rFonts w:ascii="Wingdings" w:hAnsi="Wingdings" w:hint="default"/>
+        <w:sz w:val="20"/>
+      </w:rPr>
+    </w:lvl>
+    <w:lvl w:ilvl="7" w:tentative="1">
+      <w:start w:val="1"/>
+      <w:numFmt w:val="bullet"/>
+      <w:lvlText w:val=""/>
+      <w:lvlJc w:val="left"/>
+      <w:pPr>
+        <w:tabs>
+          <w:tab w:val="num" w:pos="5760"/>
+        </w:tabs>
+        <w:ind w:left="5760" w:hanging="360"/>
+      </w:pPr>
+      <w:rPr>
+        <w:rFonts w:ascii="Wingdings" w:hAnsi="Wingdings" w:hint="default"/>
+        <w:sz w:val="20"/>
+      </w:rPr>
+    </w:lvl>
+    <w:lvl w:ilvl="8" w:tentative="1">
+      <w:start w:val="1"/>
+      <w:numFmt w:val="bullet"/>
+      <w:lvlText w:val=""/>
+      <w:lvlJc w:val="left"/>
+      <w:pPr>
+        <w:tabs>
+          <w:tab w:val="num" w:pos="6480"/>
+        </w:tabs>
+        <w:ind w:left="6480" w:hanging="360"/>
+      </w:pPr>
+      <w:rPr>
+        <w:rFonts w:ascii="Wingdings" w:hAnsi="Wingdings" w:hint="default"/>
+        <w:sz w:val="20"/>
+      </w:rPr>
+    </w:lvl>
+  </w:abstractNum>
+  <w:abstractNum w:abstractNumId="9" w15:restartNumberingAfterBreak="0">
     <w:nsid w:val="22037567"/>
     <w:multiLevelType w:val="multilevel"/>
     <w:tmpl w:val="9D8C8CDC"/>
@@ -4324,7 +6115,7 @@
       </w:rPr>
     </w:lvl>
   </w:abstractNum>
-  <w:abstractNum w:abstractNumId="7" w15:restartNumberingAfterBreak="0">
+  <w:abstractNum w:abstractNumId="10" w15:restartNumberingAfterBreak="0">
     <w:nsid w:val="361F75E7"/>
     <w:multiLevelType w:val="multilevel"/>
     <w:tmpl w:val="E9F64254"/>
@@ -4473,7 +6264,7 @@
       </w:rPr>
     </w:lvl>
   </w:abstractNum>
-  <w:abstractNum w:abstractNumId="8" w15:restartNumberingAfterBreak="0">
+  <w:abstractNum w:abstractNumId="11" w15:restartNumberingAfterBreak="0">
     <w:nsid w:val="423064FA"/>
     <w:multiLevelType w:val="multilevel"/>
     <w:tmpl w:val="08701520"/>
@@ -4586,7 +6377,305 @@
       </w:pPr>
     </w:lvl>
   </w:abstractNum>
-  <w:abstractNum w:abstractNumId="9" w15:restartNumberingAfterBreak="0">
+  <w:abstractNum w:abstractNumId="12" w15:restartNumberingAfterBreak="0">
+    <w:nsid w:val="457D12FD"/>
+    <w:multiLevelType w:val="multilevel"/>
+    <w:tmpl w:val="59A6C1F8"/>
+    <w:lvl w:ilvl="0">
+      <w:start w:val="1"/>
+      <w:numFmt w:val="bullet"/>
+      <w:lvlText w:val=""/>
+      <w:lvlJc w:val="left"/>
+      <w:pPr>
+        <w:tabs>
+          <w:tab w:val="num" w:pos="720"/>
+        </w:tabs>
+        <w:ind w:left="720" w:hanging="360"/>
+      </w:pPr>
+      <w:rPr>
+        <w:rFonts w:ascii="Symbol" w:hAnsi="Symbol" w:hint="default"/>
+        <w:sz w:val="20"/>
+      </w:rPr>
+    </w:lvl>
+    <w:lvl w:ilvl="1" w:tentative="1">
+      <w:start w:val="1"/>
+      <w:numFmt w:val="bullet"/>
+      <w:lvlText w:val="o"/>
+      <w:lvlJc w:val="left"/>
+      <w:pPr>
+        <w:tabs>
+          <w:tab w:val="num" w:pos="1440"/>
+        </w:tabs>
+        <w:ind w:left="1440" w:hanging="360"/>
+      </w:pPr>
+      <w:rPr>
+        <w:rFonts w:ascii="Courier New" w:hAnsi="Courier New" w:hint="default"/>
+        <w:sz w:val="20"/>
+      </w:rPr>
+    </w:lvl>
+    <w:lvl w:ilvl="2" w:tentative="1">
+      <w:start w:val="1"/>
+      <w:numFmt w:val="bullet"/>
+      <w:lvlText w:val=""/>
+      <w:lvlJc w:val="left"/>
+      <w:pPr>
+        <w:tabs>
+          <w:tab w:val="num" w:pos="2160"/>
+        </w:tabs>
+        <w:ind w:left="2160" w:hanging="360"/>
+      </w:pPr>
+      <w:rPr>
+        <w:rFonts w:ascii="Wingdings" w:hAnsi="Wingdings" w:hint="default"/>
+        <w:sz w:val="20"/>
+      </w:rPr>
+    </w:lvl>
+    <w:lvl w:ilvl="3" w:tentative="1">
+      <w:start w:val="1"/>
+      <w:numFmt w:val="bullet"/>
+      <w:lvlText w:val=""/>
+      <w:lvlJc w:val="left"/>
+      <w:pPr>
+        <w:tabs>
+          <w:tab w:val="num" w:pos="2880"/>
+        </w:tabs>
+        <w:ind w:left="2880" w:hanging="360"/>
+      </w:pPr>
+      <w:rPr>
+        <w:rFonts w:ascii="Wingdings" w:hAnsi="Wingdings" w:hint="default"/>
+        <w:sz w:val="20"/>
+      </w:rPr>
+    </w:lvl>
+    <w:lvl w:ilvl="4" w:tentative="1">
+      <w:start w:val="1"/>
+      <w:numFmt w:val="bullet"/>
+      <w:lvlText w:val=""/>
+      <w:lvlJc w:val="left"/>
+      <w:pPr>
+        <w:tabs>
+          <w:tab w:val="num" w:pos="3600"/>
+        </w:tabs>
+        <w:ind w:left="3600" w:hanging="360"/>
+      </w:pPr>
+      <w:rPr>
+        <w:rFonts w:ascii="Wingdings" w:hAnsi="Wingdings" w:hint="default"/>
+        <w:sz w:val="20"/>
+      </w:rPr>
+    </w:lvl>
+    <w:lvl w:ilvl="5" w:tentative="1">
+      <w:start w:val="1"/>
+      <w:numFmt w:val="bullet"/>
+      <w:lvlText w:val=""/>
+      <w:lvlJc w:val="left"/>
+      <w:pPr>
+        <w:tabs>
+          <w:tab w:val="num" w:pos="4320"/>
+        </w:tabs>
+        <w:ind w:left="4320" w:hanging="360"/>
+      </w:pPr>
+      <w:rPr>
+        <w:rFonts w:ascii="Wingdings" w:hAnsi="Wingdings" w:hint="default"/>
+        <w:sz w:val="20"/>
+      </w:rPr>
+    </w:lvl>
+    <w:lvl w:ilvl="6" w:tentative="1">
+      <w:start w:val="1"/>
+      <w:numFmt w:val="bullet"/>
+      <w:lvlText w:val=""/>
+      <w:lvlJc w:val="left"/>
+      <w:pPr>
+        <w:tabs>
+          <w:tab w:val="num" w:pos="5040"/>
+        </w:tabs>
+        <w:ind w:left="5040" w:hanging="360"/>
+      </w:pPr>
+      <w:rPr>
+        <w:rFonts w:ascii="Wingdings" w:hAnsi="Wingdings" w:hint="default"/>
+        <w:sz w:val="20"/>
+      </w:rPr>
+    </w:lvl>
+    <w:lvl w:ilvl="7" w:tentative="1">
+      <w:start w:val="1"/>
+      <w:numFmt w:val="bullet"/>
+      <w:lvlText w:val=""/>
+      <w:lvlJc w:val="left"/>
+      <w:pPr>
+        <w:tabs>
+          <w:tab w:val="num" w:pos="5760"/>
+        </w:tabs>
+        <w:ind w:left="5760" w:hanging="360"/>
+      </w:pPr>
+      <w:rPr>
+        <w:rFonts w:ascii="Wingdings" w:hAnsi="Wingdings" w:hint="default"/>
+        <w:sz w:val="20"/>
+      </w:rPr>
+    </w:lvl>
+    <w:lvl w:ilvl="8" w:tentative="1">
+      <w:start w:val="1"/>
+      <w:numFmt w:val="bullet"/>
+      <w:lvlText w:val=""/>
+      <w:lvlJc w:val="left"/>
+      <w:pPr>
+        <w:tabs>
+          <w:tab w:val="num" w:pos="6480"/>
+        </w:tabs>
+        <w:ind w:left="6480" w:hanging="360"/>
+      </w:pPr>
+      <w:rPr>
+        <w:rFonts w:ascii="Wingdings" w:hAnsi="Wingdings" w:hint="default"/>
+        <w:sz w:val="20"/>
+      </w:rPr>
+    </w:lvl>
+  </w:abstractNum>
+  <w:abstractNum w:abstractNumId="13" w15:restartNumberingAfterBreak="0">
+    <w:nsid w:val="539C3F76"/>
+    <w:multiLevelType w:val="multilevel"/>
+    <w:tmpl w:val="8B40BDC8"/>
+    <w:lvl w:ilvl="0">
+      <w:start w:val="1"/>
+      <w:numFmt w:val="bullet"/>
+      <w:lvlText w:val=""/>
+      <w:lvlJc w:val="left"/>
+      <w:pPr>
+        <w:tabs>
+          <w:tab w:val="num" w:pos="720"/>
+        </w:tabs>
+        <w:ind w:left="720" w:hanging="360"/>
+      </w:pPr>
+      <w:rPr>
+        <w:rFonts w:ascii="Symbol" w:hAnsi="Symbol" w:hint="default"/>
+        <w:sz w:val="20"/>
+      </w:rPr>
+    </w:lvl>
+    <w:lvl w:ilvl="1">
+      <w:start w:val="1"/>
+      <w:numFmt w:val="bullet"/>
+      <w:lvlText w:val="o"/>
+      <w:lvlJc w:val="left"/>
+      <w:pPr>
+        <w:tabs>
+          <w:tab w:val="num" w:pos="1440"/>
+        </w:tabs>
+        <w:ind w:left="1440" w:hanging="360"/>
+      </w:pPr>
+      <w:rPr>
+        <w:rFonts w:ascii="Courier New" w:hAnsi="Courier New" w:hint="default"/>
+        <w:sz w:val="20"/>
+      </w:rPr>
+    </w:lvl>
+    <w:lvl w:ilvl="2" w:tentative="1">
+      <w:start w:val="1"/>
+      <w:numFmt w:val="bullet"/>
+      <w:lvlText w:val=""/>
+      <w:lvlJc w:val="left"/>
+      <w:pPr>
+        <w:tabs>
+          <w:tab w:val="num" w:pos="2160"/>
+        </w:tabs>
+        <w:ind w:left="2160" w:hanging="360"/>
+      </w:pPr>
+      <w:rPr>
+        <w:rFonts w:ascii="Wingdings" w:hAnsi="Wingdings" w:hint="default"/>
+        <w:sz w:val="20"/>
+      </w:rPr>
+    </w:lvl>
+    <w:lvl w:ilvl="3" w:tentative="1">
+      <w:start w:val="1"/>
+      <w:numFmt w:val="bullet"/>
+      <w:lvlText w:val=""/>
+      <w:lvlJc w:val="left"/>
+      <w:pPr>
+        <w:tabs>
+          <w:tab w:val="num" w:pos="2880"/>
+        </w:tabs>
+        <w:ind w:left="2880" w:hanging="360"/>
+      </w:pPr>
+      <w:rPr>
+        <w:rFonts w:ascii="Wingdings" w:hAnsi="Wingdings" w:hint="default"/>
+        <w:sz w:val="20"/>
+      </w:rPr>
+    </w:lvl>
+    <w:lvl w:ilvl="4" w:tentative="1">
+      <w:start w:val="1"/>
+      <w:numFmt w:val="bullet"/>
+      <w:lvlText w:val=""/>
+      <w:lvlJc w:val="left"/>
+      <w:pPr>
+        <w:tabs>
+          <w:tab w:val="num" w:pos="3600"/>
+        </w:tabs>
+        <w:ind w:left="3600" w:hanging="360"/>
+      </w:pPr>
+      <w:rPr>
+        <w:rFonts w:ascii="Wingdings" w:hAnsi="Wingdings" w:hint="default"/>
+        <w:sz w:val="20"/>
+      </w:rPr>
+    </w:lvl>
+    <w:lvl w:ilvl="5" w:tentative="1">
+      <w:start w:val="1"/>
+      <w:numFmt w:val="bullet"/>
+      <w:lvlText w:val=""/>
+      <w:lvlJc w:val="left"/>
+      <w:pPr>
+        <w:tabs>
+          <w:tab w:val="num" w:pos="4320"/>
+        </w:tabs>
+        <w:ind w:left="4320" w:hanging="360"/>
+      </w:pPr>
+      <w:rPr>
+        <w:rFonts w:ascii="Wingdings" w:hAnsi="Wingdings" w:hint="default"/>
+        <w:sz w:val="20"/>
+      </w:rPr>
+    </w:lvl>
+    <w:lvl w:ilvl="6" w:tentative="1">
+      <w:start w:val="1"/>
+      <w:numFmt w:val="bullet"/>
+      <w:lvlText w:val=""/>
+      <w:lvlJc w:val="left"/>
+      <w:pPr>
+        <w:tabs>
+          <w:tab w:val="num" w:pos="5040"/>
+        </w:tabs>
+        <w:ind w:left="5040" w:hanging="360"/>
+      </w:pPr>
+      <w:rPr>
+        <w:rFonts w:ascii="Wingdings" w:hAnsi="Wingdings" w:hint="default"/>
+        <w:sz w:val="20"/>
+      </w:rPr>
+    </w:lvl>
+    <w:lvl w:ilvl="7" w:tentative="1">
+      <w:start w:val="1"/>
+      <w:numFmt w:val="bullet"/>
+      <w:lvlText w:val=""/>
+      <w:lvlJc w:val="left"/>
+      <w:pPr>
+        <w:tabs>
+          <w:tab w:val="num" w:pos="5760"/>
+        </w:tabs>
+        <w:ind w:left="5760" w:hanging="360"/>
+      </w:pPr>
+      <w:rPr>
+        <w:rFonts w:ascii="Wingdings" w:hAnsi="Wingdings" w:hint="default"/>
+        <w:sz w:val="20"/>
+      </w:rPr>
+    </w:lvl>
+    <w:lvl w:ilvl="8" w:tentative="1">
+      <w:start w:val="1"/>
+      <w:numFmt w:val="bullet"/>
+      <w:lvlText w:val=""/>
+      <w:lvlJc w:val="left"/>
+      <w:pPr>
+        <w:tabs>
+          <w:tab w:val="num" w:pos="6480"/>
+        </w:tabs>
+        <w:ind w:left="6480" w:hanging="360"/>
+      </w:pPr>
+      <w:rPr>
+        <w:rFonts w:ascii="Wingdings" w:hAnsi="Wingdings" w:hint="default"/>
+        <w:sz w:val="20"/>
+      </w:rPr>
+    </w:lvl>
+  </w:abstractNum>
+  <w:abstractNum w:abstractNumId="14" w15:restartNumberingAfterBreak="0">
     <w:nsid w:val="548A66D6"/>
     <w:multiLevelType w:val="multilevel"/>
     <w:tmpl w:val="CA8E59AC"/>
@@ -4699,7 +6788,7 @@
       </w:pPr>
     </w:lvl>
   </w:abstractNum>
-  <w:abstractNum w:abstractNumId="10" w15:restartNumberingAfterBreak="0">
+  <w:abstractNum w:abstractNumId="15" w15:restartNumberingAfterBreak="0">
     <w:nsid w:val="565B38D4"/>
     <w:multiLevelType w:val="multilevel"/>
     <w:tmpl w:val="D5F0073A"/>
@@ -4848,7 +6937,7 @@
       </w:rPr>
     </w:lvl>
   </w:abstractNum>
-  <w:abstractNum w:abstractNumId="11" w15:restartNumberingAfterBreak="0">
+  <w:abstractNum w:abstractNumId="16" w15:restartNumberingAfterBreak="0">
     <w:nsid w:val="56FE1380"/>
     <w:multiLevelType w:val="multilevel"/>
     <w:tmpl w:val="ADAAE474"/>
@@ -4997,7 +7086,7 @@
       </w:rPr>
     </w:lvl>
   </w:abstractNum>
-  <w:abstractNum w:abstractNumId="12" w15:restartNumberingAfterBreak="0">
+  <w:abstractNum w:abstractNumId="17" w15:restartNumberingAfterBreak="0">
     <w:nsid w:val="5A954E13"/>
     <w:multiLevelType w:val="multilevel"/>
     <w:tmpl w:val="E8384A2A"/>
@@ -5110,7 +7199,7 @@
       </w:pPr>
     </w:lvl>
   </w:abstractNum>
-  <w:abstractNum w:abstractNumId="13" w15:restartNumberingAfterBreak="0">
+  <w:abstractNum w:abstractNumId="18" w15:restartNumberingAfterBreak="0">
     <w:nsid w:val="63CF42F3"/>
     <w:multiLevelType w:val="multilevel"/>
     <w:tmpl w:val="29224C36"/>
@@ -5223,7 +7312,156 @@
       </w:pPr>
     </w:lvl>
   </w:abstractNum>
-  <w:abstractNum w:abstractNumId="14" w15:restartNumberingAfterBreak="0">
+  <w:abstractNum w:abstractNumId="19" w15:restartNumberingAfterBreak="0">
+    <w:nsid w:val="6BE90806"/>
+    <w:multiLevelType w:val="multilevel"/>
+    <w:tmpl w:val="1D78C628"/>
+    <w:lvl w:ilvl="0">
+      <w:start w:val="1"/>
+      <w:numFmt w:val="bullet"/>
+      <w:lvlText w:val=""/>
+      <w:lvlJc w:val="left"/>
+      <w:pPr>
+        <w:tabs>
+          <w:tab w:val="num" w:pos="720"/>
+        </w:tabs>
+        <w:ind w:left="720" w:hanging="360"/>
+      </w:pPr>
+      <w:rPr>
+        <w:rFonts w:ascii="Symbol" w:hAnsi="Symbol" w:hint="default"/>
+        <w:sz w:val="20"/>
+      </w:rPr>
+    </w:lvl>
+    <w:lvl w:ilvl="1" w:tentative="1">
+      <w:start w:val="1"/>
+      <w:numFmt w:val="bullet"/>
+      <w:lvlText w:val="o"/>
+      <w:lvlJc w:val="left"/>
+      <w:pPr>
+        <w:tabs>
+          <w:tab w:val="num" w:pos="1440"/>
+        </w:tabs>
+        <w:ind w:left="1440" w:hanging="360"/>
+      </w:pPr>
+      <w:rPr>
+        <w:rFonts w:ascii="Courier New" w:hAnsi="Courier New" w:hint="default"/>
+        <w:sz w:val="20"/>
+      </w:rPr>
+    </w:lvl>
+    <w:lvl w:ilvl="2" w:tentative="1">
+      <w:start w:val="1"/>
+      <w:numFmt w:val="bullet"/>
+      <w:lvlText w:val=""/>
+      <w:lvlJc w:val="left"/>
+      <w:pPr>
+        <w:tabs>
+          <w:tab w:val="num" w:pos="2160"/>
+        </w:tabs>
+        <w:ind w:left="2160" w:hanging="360"/>
+      </w:pPr>
+      <w:rPr>
+        <w:rFonts w:ascii="Wingdings" w:hAnsi="Wingdings" w:hint="default"/>
+        <w:sz w:val="20"/>
+      </w:rPr>
+    </w:lvl>
+    <w:lvl w:ilvl="3" w:tentative="1">
+      <w:start w:val="1"/>
+      <w:numFmt w:val="bullet"/>
+      <w:lvlText w:val=""/>
+      <w:lvlJc w:val="left"/>
+      <w:pPr>
+        <w:tabs>
+          <w:tab w:val="num" w:pos="2880"/>
+        </w:tabs>
+        <w:ind w:left="2880" w:hanging="360"/>
+      </w:pPr>
+      <w:rPr>
+        <w:rFonts w:ascii="Wingdings" w:hAnsi="Wingdings" w:hint="default"/>
+        <w:sz w:val="20"/>
+      </w:rPr>
+    </w:lvl>
+    <w:lvl w:ilvl="4" w:tentative="1">
+      <w:start w:val="1"/>
+      <w:numFmt w:val="bullet"/>
+      <w:lvlText w:val=""/>
+      <w:lvlJc w:val="left"/>
+      <w:pPr>
+        <w:tabs>
+          <w:tab w:val="num" w:pos="3600"/>
+        </w:tabs>
+        <w:ind w:left="3600" w:hanging="360"/>
+      </w:pPr>
+      <w:rPr>
+        <w:rFonts w:ascii="Wingdings" w:hAnsi="Wingdings" w:hint="default"/>
+        <w:sz w:val="20"/>
+      </w:rPr>
+    </w:lvl>
+    <w:lvl w:ilvl="5" w:tentative="1">
+      <w:start w:val="1"/>
+      <w:numFmt w:val="bullet"/>
+      <w:lvlText w:val=""/>
+      <w:lvlJc w:val="left"/>
+      <w:pPr>
+        <w:tabs>
+          <w:tab w:val="num" w:pos="4320"/>
+        </w:tabs>
+        <w:ind w:left="4320" w:hanging="360"/>
+      </w:pPr>
+      <w:rPr>
+        <w:rFonts w:ascii="Wingdings" w:hAnsi="Wingdings" w:hint="default"/>
+        <w:sz w:val="20"/>
+      </w:rPr>
+    </w:lvl>
+    <w:lvl w:ilvl="6" w:tentative="1">
+      <w:start w:val="1"/>
+      <w:numFmt w:val="bullet"/>
+      <w:lvlText w:val=""/>
+      <w:lvlJc w:val="left"/>
+      <w:pPr>
+        <w:tabs>
+          <w:tab w:val="num" w:pos="5040"/>
+        </w:tabs>
+        <w:ind w:left="5040" w:hanging="360"/>
+      </w:pPr>
+      <w:rPr>
+        <w:rFonts w:ascii="Wingdings" w:hAnsi="Wingdings" w:hint="default"/>
+        <w:sz w:val="20"/>
+      </w:rPr>
+    </w:lvl>
+    <w:lvl w:ilvl="7" w:tentative="1">
+      <w:start w:val="1"/>
+      <w:numFmt w:val="bullet"/>
+      <w:lvlText w:val=""/>
+      <w:lvlJc w:val="left"/>
+      <w:pPr>
+        <w:tabs>
+          <w:tab w:val="num" w:pos="5760"/>
+        </w:tabs>
+        <w:ind w:left="5760" w:hanging="360"/>
+      </w:pPr>
+      <w:rPr>
+        <w:rFonts w:ascii="Wingdings" w:hAnsi="Wingdings" w:hint="default"/>
+        <w:sz w:val="20"/>
+      </w:rPr>
+    </w:lvl>
+    <w:lvl w:ilvl="8" w:tentative="1">
+      <w:start w:val="1"/>
+      <w:numFmt w:val="bullet"/>
+      <w:lvlText w:val=""/>
+      <w:lvlJc w:val="left"/>
+      <w:pPr>
+        <w:tabs>
+          <w:tab w:val="num" w:pos="6480"/>
+        </w:tabs>
+        <w:ind w:left="6480" w:hanging="360"/>
+      </w:pPr>
+      <w:rPr>
+        <w:rFonts w:ascii="Wingdings" w:hAnsi="Wingdings" w:hint="default"/>
+        <w:sz w:val="20"/>
+      </w:rPr>
+    </w:lvl>
+  </w:abstractNum>
+  <w:abstractNum w:abstractNumId="20" w15:restartNumberingAfterBreak="0">
     <w:nsid w:val="7B327213"/>
     <w:multiLevelType w:val="multilevel"/>
     <w:tmpl w:val="1122AFA0"/>
@@ -5372,56 +7610,74 @@
       </w:rPr>
     </w:lvl>
   </w:abstractNum>
-  <w:num w:numId="1" w16cid:durableId="1406488337">
+  <w:num w:numId="1">
+    <w:abstractNumId w:val="15"/>
+  </w:num>
+  <w:num w:numId="2">
+    <w:abstractNumId w:val="0"/>
+  </w:num>
+  <w:num w:numId="3">
+    <w:abstractNumId w:val="9"/>
+  </w:num>
+  <w:num w:numId="4">
+    <w:abstractNumId w:val="1"/>
+  </w:num>
+  <w:num w:numId="5">
+    <w:abstractNumId w:val="20"/>
+  </w:num>
+  <w:num w:numId="6">
+    <w:abstractNumId w:val="18"/>
+  </w:num>
+  <w:num w:numId="7">
+    <w:abstractNumId w:val="14"/>
+  </w:num>
+  <w:num w:numId="8">
+    <w:abstractNumId w:val="11"/>
+  </w:num>
+  <w:num w:numId="9">
+    <w:abstractNumId w:val="7"/>
+  </w:num>
+  <w:num w:numId="10">
+    <w:abstractNumId w:val="17"/>
+  </w:num>
+  <w:num w:numId="11">
     <w:abstractNumId w:val="10"/>
   </w:num>
-  <w:num w:numId="2" w16cid:durableId="565990142">
-    <w:abstractNumId w:val="0"/>
+  <w:num w:numId="12">
+    <w:abstractNumId w:val="2"/>
   </w:num>
-  <w:num w:numId="3" w16cid:durableId="549806173">
+  <w:num w:numId="13">
+    <w:abstractNumId w:val="16"/>
+  </w:num>
+  <w:num w:numId="14">
+    <w:abstractNumId w:val="4"/>
+  </w:num>
+  <w:num w:numId="15">
+    <w:abstractNumId w:val="3"/>
+  </w:num>
+  <w:num w:numId="16">
+    <w:abstractNumId w:val="5"/>
+  </w:num>
+  <w:num w:numId="17">
+    <w:abstractNumId w:val="13"/>
+  </w:num>
+  <w:num w:numId="18">
+    <w:abstractNumId w:val="8"/>
+  </w:num>
+  <w:num w:numId="19">
     <w:abstractNumId w:val="6"/>
   </w:num>
-  <w:num w:numId="4" w16cid:durableId="1451977040">
-    <w:abstractNumId w:val="1"/>
-  </w:num>
-  <w:num w:numId="5" w16cid:durableId="9263608">
-    <w:abstractNumId w:val="14"/>
-  </w:num>
-  <w:num w:numId="6" w16cid:durableId="18628016">
-    <w:abstractNumId w:val="13"/>
-  </w:num>
-  <w:num w:numId="7" w16cid:durableId="1372074915">
-    <w:abstractNumId w:val="9"/>
-  </w:num>
-  <w:num w:numId="8" w16cid:durableId="1807696287">
-    <w:abstractNumId w:val="8"/>
-  </w:num>
-  <w:num w:numId="9" w16cid:durableId="1478915181">
-    <w:abstractNumId w:val="5"/>
-  </w:num>
-  <w:num w:numId="10" w16cid:durableId="1131553851">
+  <w:num w:numId="20">
     <w:abstractNumId w:val="12"/>
   </w:num>
-  <w:num w:numId="11" w16cid:durableId="259142979">
-    <w:abstractNumId w:val="7"/>
-  </w:num>
-  <w:num w:numId="12" w16cid:durableId="1068839210">
-    <w:abstractNumId w:val="2"/>
-  </w:num>
-  <w:num w:numId="13" w16cid:durableId="2065178322">
-    <w:abstractNumId w:val="11"/>
-  </w:num>
-  <w:num w:numId="14" w16cid:durableId="1087267596">
-    <w:abstractNumId w:val="4"/>
-  </w:num>
-  <w:num w:numId="15" w16cid:durableId="1679384847">
-    <w:abstractNumId w:val="3"/>
+  <w:num w:numId="21">
+    <w:abstractNumId w:val="19"/>
   </w:num>
 </w:numbering>
 </file>
 
 <file path=word/styles.xml><?xml version="1.0" encoding="utf-8"?>
-<w:styles xmlns:mc="http://schemas.openxmlformats.org/markup-compatibility/2006" xmlns:r="http://schemas.openxmlformats.org/officeDocument/2006/relationships" xmlns:w="http://schemas.openxmlformats.org/wordprocessingml/2006/main" xmlns:w14="http://schemas.microsoft.com/office/word/2010/wordml" xmlns:w15="http://schemas.microsoft.com/office/word/2012/wordml" xmlns:w16cex="http://schemas.microsoft.com/office/word/2018/wordml/cex" xmlns:w16cid="http://schemas.microsoft.com/office/word/2016/wordml/cid" xmlns:w16="http://schemas.microsoft.com/office/word/2018/wordml" xmlns:w16du="http://schemas.microsoft.com/office/word/2023/wordml/word16du" xmlns:w16sdtdh="http://schemas.microsoft.com/office/word/2020/wordml/sdtdatahash" xmlns:w16sdtfl="http://schemas.microsoft.com/office/word/2024/wordml/sdtformatlock" xmlns:w16se="http://schemas.microsoft.com/office/word/2015/wordml/symex" mc:Ignorable="w14 w15 w16se w16cid w16 w16cex w16sdtdh w16sdtfl w16du">
+<w:styles xmlns:mc="http://schemas.openxmlformats.org/markup-compatibility/2006" xmlns:r="http://schemas.openxmlformats.org/officeDocument/2006/relationships" xmlns:w="http://schemas.openxmlformats.org/wordprocessingml/2006/main" xmlns:w14="http://schemas.microsoft.com/office/word/2010/wordml" xmlns:w15="http://schemas.microsoft.com/office/word/2012/wordml" xmlns:w16cex="http://schemas.microsoft.com/office/word/2018/wordml/cex" xmlns:w16cid="http://schemas.microsoft.com/office/word/2016/wordml/cid" xmlns:w16="http://schemas.microsoft.com/office/word/2018/wordml" xmlns:w16sdtdh="http://schemas.microsoft.com/office/word/2020/wordml/sdtdatahash" xmlns:w16se="http://schemas.microsoft.com/office/word/2015/wordml/symex" mc:Ignorable="w14 w15 w16se w16cid w16 w16cex w16sdtdh">
   <w:docDefaults>
     <w:rPrDefault>
       <w:rPr>
@@ -6023,6 +8279,7 @@
   <w:style w:type="character" w:default="1" w:styleId="Fuentedeprrafopredeter">
     <w:name w:val="Default Paragraph Font"/>
     <w:uiPriority w:val="1"/>
+    <w:semiHidden/>
     <w:unhideWhenUsed/>
   </w:style>
   <w:style w:type="table" w:default="1" w:styleId="Tablanormal">
@@ -6336,6 +8593,38 @@
       <w:spacing w:val="5"/>
     </w:rPr>
   </w:style>
+  <w:style w:type="paragraph" w:styleId="NormalWeb">
+    <w:name w:val="Normal (Web)"/>
+    <w:basedOn w:val="Normal"/>
+    <w:uiPriority w:val="99"/>
+    <w:semiHidden/>
+    <w:unhideWhenUsed/>
+    <w:rsid w:val="00CF3BB1"/>
+    <w:pPr>
+      <w:spacing w:before="100" w:beforeAutospacing="1" w:after="100" w:afterAutospacing="1" w:line="240" w:lineRule="auto"/>
+    </w:pPr>
+    <w:rPr>
+      <w:rFonts w:ascii="Times New Roman" w:eastAsia="Times New Roman" w:hAnsi="Times New Roman" w:cs="Times New Roman"/>
+      <w:kern w:val="0"/>
+      <w:sz w:val="24"/>
+      <w:szCs w:val="24"/>
+      <w:lang w:eastAsia="es-AR"/>
+      <w14:ligatures w14:val="none"/>
+    </w:rPr>
+  </w:style>
+  <w:style w:type="character" w:styleId="CdigoHTML">
+    <w:name w:val="HTML Code"/>
+    <w:basedOn w:val="Fuentedeprrafopredeter"/>
+    <w:uiPriority w:val="99"/>
+    <w:semiHidden/>
+    <w:unhideWhenUsed/>
+    <w:rsid w:val="00CF3BB1"/>
+    <w:rPr>
+      <w:rFonts w:ascii="Courier New" w:eastAsia="Times New Roman" w:hAnsi="Courier New" w:cs="Courier New"/>
+      <w:sz w:val="20"/>
+      <w:szCs w:val="20"/>
+    </w:rPr>
+  </w:style>
 </w:styles>
 </file>
 

</xml_diff>